<commit_message>
eda changed from python to r
</commit_message>
<xml_diff>
--- a/Contact_Interview_Info.docx
+++ b/Contact_Interview_Info.docx
@@ -4,332 +4,1108 @@
   <w:body>
     <w:p>
       <w:pPr>
-        <w:rPr>
+        <w:jc w:val="center"/>
+        <w:rPr>
+          <w:rFonts w:ascii="Times New Roman" w:hAnsi="Times New Roman" w:cs="Times New Roman"/>
           <w:b/>
           <w:bCs/>
         </w:rPr>
       </w:pPr>
       <w:r>
         <w:rPr>
+          <w:rFonts w:ascii="Times New Roman" w:hAnsi="Times New Roman" w:cs="Times New Roman"/>
           <w:b/>
           <w:bCs/>
         </w:rPr>
-        <w:t>Goals</w:t>
-      </w:r>
-    </w:p>
-    <w:p>
-      <w:pPr>
-        <w:pStyle w:val="ListParagraph"/>
+        <w:t>PBS Utah Project Notes</w:t>
+      </w:r>
+    </w:p>
+    <w:p>
+      <w:pPr>
+        <w:rPr>
+          <w:rFonts w:ascii="Times New Roman" w:hAnsi="Times New Roman" w:cs="Times New Roman"/>
+        </w:rPr>
+      </w:pPr>
+      <w:r>
+        <w:rPr>
+          <w:rFonts w:ascii="Times New Roman" w:hAnsi="Times New Roman" w:cs="Times New Roman"/>
+        </w:rPr>
+        <w:t>1. Project Goals</w:t>
+      </w:r>
+    </w:p>
+    <w:p>
+      <w:pPr>
+        <w:rPr>
+          <w:rFonts w:ascii="Times New Roman" w:hAnsi="Times New Roman" w:cs="Times New Roman"/>
+        </w:rPr>
+      </w:pPr>
+      <w:r>
+        <w:rPr>
+          <w:rFonts w:ascii="Times New Roman" w:hAnsi="Times New Roman" w:cs="Times New Roman"/>
+        </w:rPr>
+        <w:t>Primary Goal</w:t>
+      </w:r>
+    </w:p>
+    <w:p>
+      <w:pPr>
+        <w:rPr>
+          <w:rFonts w:ascii="Times New Roman" w:hAnsi="Times New Roman" w:cs="Times New Roman"/>
+        </w:rPr>
+      </w:pPr>
+      <w:r>
+        <w:rPr>
+          <w:rFonts w:ascii="Times New Roman" w:hAnsi="Times New Roman" w:cs="Times New Roman"/>
+        </w:rPr>
+        <w:t>Identify current major donors who may be strong candidates for increased annual giving.</w:t>
+      </w:r>
+    </w:p>
+    <w:p>
+      <w:pPr>
         <w:numPr>
           <w:ilvl w:val="0"/>
-          <w:numId w:val="1"/>
+          <w:numId w:val="3"/>
         </w:numPr>
-      </w:pPr>
-      <w:r>
-        <w:t>Aggregate data to the year level</w:t>
-      </w:r>
-    </w:p>
-    <w:p>
-      <w:pPr>
-        <w:pStyle w:val="ListParagraph"/>
+        <w:rPr>
+          <w:rFonts w:ascii="Times New Roman" w:hAnsi="Times New Roman" w:cs="Times New Roman"/>
+        </w:rPr>
+      </w:pPr>
+      <w:r>
+        <w:rPr>
+          <w:rFonts w:ascii="Times New Roman" w:hAnsi="Times New Roman" w:cs="Times New Roman"/>
+        </w:rPr>
+        <w:t>PBS Utah considers annual giving of more than $1,200 to be major-donor-level giving.</w:t>
+      </w:r>
+    </w:p>
+    <w:p>
+      <w:pPr>
+        <w:numPr>
+          <w:ilvl w:val="0"/>
+          <w:numId w:val="3"/>
+        </w:numPr>
+        <w:rPr>
+          <w:rFonts w:ascii="Times New Roman" w:hAnsi="Times New Roman" w:cs="Times New Roman"/>
+        </w:rPr>
+      </w:pPr>
+      <w:r>
+        <w:rPr>
+          <w:rFonts w:ascii="Times New Roman" w:hAnsi="Times New Roman" w:cs="Times New Roman"/>
+        </w:rPr>
+        <w:t>Giving frequency should not change this classification.</w:t>
+      </w:r>
+    </w:p>
+    <w:p>
+      <w:pPr>
         <w:numPr>
           <w:ilvl w:val="1"/>
-          <w:numId w:val="1"/>
+          <w:numId w:val="3"/>
         </w:numPr>
-      </w:pPr>
-      <w:r>
-        <w:t>Mid July Donation Spike due to cutting of federal funding</w:t>
-      </w:r>
-    </w:p>
-    <w:p>
-      <w:pPr>
-        <w:pStyle w:val="ListParagraph"/>
+        <w:rPr>
+          <w:rFonts w:ascii="Times New Roman" w:hAnsi="Times New Roman" w:cs="Times New Roman"/>
+        </w:rPr>
+      </w:pPr>
+      <w:r>
+        <w:rPr>
+          <w:rFonts w:ascii="Times New Roman" w:hAnsi="Times New Roman" w:cs="Times New Roman"/>
+        </w:rPr>
+        <w:t>Example: A donor giving $100 per month is treated similarly to a donor making a single $1,200 annual contribution.</w:t>
+      </w:r>
+    </w:p>
+    <w:p>
+      <w:pPr>
         <w:numPr>
           <w:ilvl w:val="0"/>
-          <w:numId w:val="1"/>
+          <w:numId w:val="3"/>
         </w:numPr>
-      </w:pPr>
-      <w:r>
-        <w:t>Create a value for if donation amount increase from prior year</w:t>
-      </w:r>
-    </w:p>
-    <w:p>
-      <w:pPr>
-        <w:pStyle w:val="ListParagraph"/>
+        <w:rPr>
+          <w:rFonts w:ascii="Times New Roman" w:hAnsi="Times New Roman" w:cs="Times New Roman"/>
+        </w:rPr>
+      </w:pPr>
+      <w:r>
+        <w:rPr>
+          <w:rFonts w:ascii="Times New Roman" w:hAnsi="Times New Roman" w:cs="Times New Roman"/>
+        </w:rPr>
+        <w:t>Final deliverable: Interactive dashboard, with a dashboard tool preferred.</w:t>
+      </w:r>
+    </w:p>
+    <w:p>
+      <w:pPr>
+        <w:rPr>
+          <w:rFonts w:ascii="Times New Roman" w:hAnsi="Times New Roman" w:cs="Times New Roman"/>
+        </w:rPr>
+      </w:pPr>
+      <w:r>
+        <w:rPr>
+          <w:rFonts w:ascii="Times New Roman" w:hAnsi="Times New Roman" w:cs="Times New Roman"/>
+        </w:rPr>
+        <w:t>Secondary Goal</w:t>
+      </w:r>
+    </w:p>
+    <w:p>
+      <w:pPr>
+        <w:rPr>
+          <w:rFonts w:ascii="Times New Roman" w:hAnsi="Times New Roman" w:cs="Times New Roman"/>
+        </w:rPr>
+      </w:pPr>
+      <w:r>
+        <w:rPr>
+          <w:rFonts w:ascii="Times New Roman" w:hAnsi="Times New Roman" w:cs="Times New Roman"/>
+        </w:rPr>
+        <w:t>Identify lower-level donors who show potential to become major donors.</w:t>
+      </w:r>
+    </w:p>
+    <w:p>
+      <w:pPr>
+        <w:rPr>
+          <w:rFonts w:ascii="Times New Roman" w:hAnsi="Times New Roman" w:cs="Times New Roman"/>
+        </w:rPr>
+      </w:pPr>
+      <w:r>
+        <w:rPr>
+          <w:rFonts w:ascii="Times New Roman" w:hAnsi="Times New Roman" w:cs="Times New Roman"/>
+        </w:rPr>
+        <w:t>Supporting Analytical Goals</w:t>
+      </w:r>
+    </w:p>
+    <w:p>
+      <w:pPr>
         <w:numPr>
           <w:ilvl w:val="0"/>
-          <w:numId w:val="1"/>
+          <w:numId w:val="4"/>
         </w:numPr>
-      </w:pPr>
-      <w:r>
-        <w:t>Seek to categorize constituents by donation level</w:t>
-      </w:r>
-    </w:p>
-    <w:p>
-      <w:pPr>
-        <w:pStyle w:val="ListParagraph"/>
+        <w:rPr>
+          <w:rFonts w:ascii="Times New Roman" w:hAnsi="Times New Roman" w:cs="Times New Roman"/>
+        </w:rPr>
+      </w:pPr>
+      <w:r>
+        <w:rPr>
+          <w:rFonts w:ascii="Times New Roman" w:hAnsi="Times New Roman" w:cs="Times New Roman"/>
+        </w:rPr>
+        <w:t>Aggregate donation activity to the constituent-year level.</w:t>
+      </w:r>
+    </w:p>
+    <w:p>
+      <w:pPr>
         <w:numPr>
           <w:ilvl w:val="0"/>
-          <w:numId w:val="1"/>
+          <w:numId w:val="4"/>
         </w:numPr>
-      </w:pPr>
-      <w:r>
-        <w:t>Final Goal: Who are “major donors” that can be solicited for increased annual donations</w:t>
-      </w:r>
-    </w:p>
-    <w:p>
-      <w:pPr>
-        <w:pStyle w:val="ListParagraph"/>
+        <w:rPr>
+          <w:rFonts w:ascii="Times New Roman" w:hAnsi="Times New Roman" w:cs="Times New Roman"/>
+        </w:rPr>
+      </w:pPr>
+      <w:r>
+        <w:rPr>
+          <w:rFonts w:ascii="Times New Roman" w:hAnsi="Times New Roman" w:cs="Times New Roman"/>
+        </w:rPr>
+        <w:t>Categorize constituents by annual donation level.</w:t>
+      </w:r>
+    </w:p>
+    <w:p>
+      <w:pPr>
+        <w:numPr>
+          <w:ilvl w:val="0"/>
+          <w:numId w:val="4"/>
+        </w:numPr>
+        <w:rPr>
+          <w:rFonts w:ascii="Times New Roman" w:hAnsi="Times New Roman" w:cs="Times New Roman"/>
+        </w:rPr>
+      </w:pPr>
+      <w:r>
+        <w:rPr>
+          <w:rFonts w:ascii="Times New Roman" w:hAnsi="Times New Roman" w:cs="Times New Roman"/>
+        </w:rPr>
+        <w:t>Create an indicator for whether a constituent's annual giving increased from the prior year.</w:t>
+      </w:r>
+    </w:p>
+    <w:p>
+      <w:pPr>
+        <w:numPr>
+          <w:ilvl w:val="0"/>
+          <w:numId w:val="4"/>
+        </w:numPr>
+        <w:rPr>
+          <w:rFonts w:ascii="Times New Roman" w:hAnsi="Times New Roman" w:cs="Times New Roman"/>
+        </w:rPr>
+      </w:pPr>
+      <w:r>
+        <w:rPr>
+          <w:rFonts w:ascii="Times New Roman" w:hAnsi="Times New Roman" w:cs="Times New Roman"/>
+        </w:rPr>
+        <w:t>Distinguish between one-time and recurring/continual donors.</w:t>
+      </w:r>
+    </w:p>
+    <w:p>
+      <w:pPr>
+        <w:numPr>
+          <w:ilvl w:val="0"/>
+          <w:numId w:val="4"/>
+        </w:numPr>
+        <w:rPr>
+          <w:rFonts w:ascii="Times New Roman" w:hAnsi="Times New Roman" w:cs="Times New Roman"/>
+        </w:rPr>
+      </w:pPr>
+      <w:r>
+        <w:rPr>
+          <w:rFonts w:ascii="Times New Roman" w:hAnsi="Times New Roman" w:cs="Times New Roman"/>
+        </w:rPr>
+        <w:t>Investigate the mid-July donation spike associated with the federal funding cuts.</w:t>
+      </w:r>
+    </w:p>
+    <w:p>
+      <w:pPr>
+        <w:rPr>
+          <w:rFonts w:ascii="Times New Roman" w:hAnsi="Times New Roman" w:cs="Times New Roman"/>
+        </w:rPr>
+      </w:pPr>
+      <w:r>
+        <w:rPr>
+          <w:rFonts w:ascii="Times New Roman" w:hAnsi="Times New Roman" w:cs="Times New Roman"/>
+        </w:rPr>
+        <w:t>2. Donor and Household Considerations</w:t>
+      </w:r>
+    </w:p>
+    <w:p>
+      <w:pPr>
+        <w:rPr>
+          <w:rFonts w:ascii="Times New Roman" w:hAnsi="Times New Roman" w:cs="Times New Roman"/>
+        </w:rPr>
+      </w:pPr>
+      <w:r>
+        <w:rPr>
+          <w:rFonts w:ascii="Times New Roman" w:hAnsi="Times New Roman" w:cs="Times New Roman"/>
+        </w:rPr>
+        <w:t>Major Donor Definition</w:t>
+      </w:r>
+    </w:p>
+    <w:p>
+      <w:pPr>
+        <w:numPr>
+          <w:ilvl w:val="0"/>
+          <w:numId w:val="5"/>
+        </w:numPr>
+        <w:rPr>
+          <w:rFonts w:ascii="Times New Roman" w:hAnsi="Times New Roman" w:cs="Times New Roman"/>
+        </w:rPr>
+      </w:pPr>
+      <w:r>
+        <w:rPr>
+          <w:rFonts w:ascii="Times New Roman" w:hAnsi="Times New Roman" w:cs="Times New Roman"/>
+        </w:rPr>
+        <w:t>PBS Utah membership considers annual giving above $1,200 to be major-donor-level giving.</w:t>
+      </w:r>
+    </w:p>
+    <w:p>
+      <w:pPr>
+        <w:numPr>
+          <w:ilvl w:val="0"/>
+          <w:numId w:val="5"/>
+        </w:numPr>
+        <w:rPr>
+          <w:rFonts w:ascii="Times New Roman" w:hAnsi="Times New Roman" w:cs="Times New Roman"/>
+        </w:rPr>
+      </w:pPr>
+      <w:r>
+        <w:rPr>
+          <w:rFonts w:ascii="Times New Roman" w:hAnsi="Times New Roman" w:cs="Times New Roman"/>
+        </w:rPr>
+        <w:t>Annual giving may consist of:</w:t>
+      </w:r>
+    </w:p>
+    <w:p>
+      <w:pPr>
         <w:numPr>
           <w:ilvl w:val="1"/>
-          <w:numId w:val="1"/>
+          <w:numId w:val="5"/>
         </w:numPr>
-      </w:pPr>
-      <w:r>
-        <w:t xml:space="preserve">PBS Membership is considered </w:t>
-      </w:r>
-      <w:r>
-        <w:rPr>
-          <w:u w:val="single"/>
-        </w:rPr>
-        <w:t>&gt;</w:t>
-      </w:r>
-      <w:r>
-        <w:t xml:space="preserve"> $1200</w:t>
-      </w:r>
-    </w:p>
-    <w:p>
-      <w:pPr>
-        <w:pStyle w:val="ListParagraph"/>
-        <w:numPr>
-          <w:ilvl w:val="2"/>
-          <w:numId w:val="1"/>
-        </w:numPr>
-      </w:pPr>
-      <w:r>
-        <w:t>Could be $100/month</w:t>
-      </w:r>
-    </w:p>
-    <w:p>
-      <w:pPr>
-        <w:pStyle w:val="ListParagraph"/>
+        <w:rPr>
+          <w:rFonts w:ascii="Times New Roman" w:hAnsi="Times New Roman" w:cs="Times New Roman"/>
+        </w:rPr>
+      </w:pPr>
+      <w:r>
+        <w:rPr>
+          <w:rFonts w:ascii="Times New Roman" w:hAnsi="Times New Roman" w:cs="Times New Roman"/>
+        </w:rPr>
+        <w:t>One-time contributions.</w:t>
+      </w:r>
+    </w:p>
+    <w:p>
+      <w:pPr>
         <w:numPr>
           <w:ilvl w:val="1"/>
-          <w:numId w:val="1"/>
+          <w:numId w:val="5"/>
         </w:numPr>
-      </w:pPr>
-      <w:r>
-        <w:t>Dashboard deliverable (tool preferred)</w:t>
-      </w:r>
-    </w:p>
-    <w:p>
-      <w:pPr>
-        <w:pStyle w:val="ListParagraph"/>
+        <w:rPr>
+          <w:rFonts w:ascii="Times New Roman" w:hAnsi="Times New Roman" w:cs="Times New Roman"/>
+        </w:rPr>
+      </w:pPr>
+      <w:r>
+        <w:rPr>
+          <w:rFonts w:ascii="Times New Roman" w:hAnsi="Times New Roman" w:cs="Times New Roman"/>
+        </w:rPr>
+        <w:t>Recurring monthly contributions.</w:t>
+      </w:r>
+    </w:p>
+    <w:p>
+      <w:pPr>
+        <w:numPr>
+          <w:ilvl w:val="1"/>
+          <w:numId w:val="5"/>
+        </w:numPr>
+        <w:rPr>
+          <w:rFonts w:ascii="Times New Roman" w:hAnsi="Times New Roman" w:cs="Times New Roman"/>
+        </w:rPr>
+      </w:pPr>
+      <w:r>
+        <w:rPr>
+          <w:rFonts w:ascii="Times New Roman" w:hAnsi="Times New Roman" w:cs="Times New Roman"/>
+        </w:rPr>
+        <w:t>Multiple contributions throughout the year.</w:t>
+      </w:r>
+    </w:p>
+    <w:p>
+      <w:pPr>
+        <w:rPr>
+          <w:rFonts w:ascii="Times New Roman" w:hAnsi="Times New Roman" w:cs="Times New Roman"/>
+        </w:rPr>
+      </w:pPr>
+      <w:r>
+        <w:rPr>
+          <w:rFonts w:ascii="Times New Roman" w:hAnsi="Times New Roman" w:cs="Times New Roman"/>
+        </w:rPr>
+        <w:t>Household Relationships</w:t>
+      </w:r>
+    </w:p>
+    <w:p>
+      <w:pPr>
         <w:numPr>
           <w:ilvl w:val="0"/>
-          <w:numId w:val="1"/>
+          <w:numId w:val="6"/>
         </w:numPr>
-      </w:pPr>
-      <w:r>
-        <w:t>Sub-Goal: Identify minor donors who can be solicited to become major donors</w:t>
-      </w:r>
-    </w:p>
-    <w:p/>
-    <w:p>
-      <w:pPr>
-        <w:rPr>
-          <w:b/>
-          <w:bCs/>
-        </w:rPr>
-      </w:pPr>
-      <w:r>
-        <w:rPr>
-          <w:b/>
-          <w:bCs/>
-        </w:rPr>
-        <w:t>Gifts</w:t>
-      </w:r>
-      <w:r>
-        <w:rPr>
-          <w:b/>
-          <w:bCs/>
-        </w:rPr>
-        <w:t xml:space="preserve"> to Donors</w:t>
-      </w:r>
-      <w:r>
-        <w:rPr>
-          <w:b/>
-          <w:bCs/>
-        </w:rPr>
-        <w:t>:</w:t>
-      </w:r>
-    </w:p>
-    <w:p>
-      <w:pPr>
-        <w:pStyle w:val="ListParagraph"/>
+        <w:rPr>
+          <w:rFonts w:ascii="Times New Roman" w:hAnsi="Times New Roman" w:cs="Times New Roman"/>
+        </w:rPr>
+      </w:pPr>
+      <w:r>
+        <w:rPr>
+          <w:rFonts w:ascii="Times New Roman" w:hAnsi="Times New Roman" w:cs="Times New Roman"/>
+        </w:rPr>
+        <w:t>Spouses are generally treated as a single household for fundraising purposes.</w:t>
+      </w:r>
+    </w:p>
+    <w:p>
+      <w:pPr>
         <w:numPr>
           <w:ilvl w:val="0"/>
-          <w:numId w:val="1"/>
+          <w:numId w:val="6"/>
         </w:numPr>
-      </w:pPr>
-      <w:r>
-        <w:t>Acknowledgement</w:t>
-      </w:r>
-    </w:p>
-    <w:p>
-      <w:pPr>
-        <w:pStyle w:val="ListParagraph"/>
+        <w:rPr>
+          <w:rFonts w:ascii="Times New Roman" w:hAnsi="Times New Roman" w:cs="Times New Roman"/>
+        </w:rPr>
+      </w:pPr>
+      <w:r>
+        <w:rPr>
+          <w:rFonts w:ascii="Times New Roman" w:hAnsi="Times New Roman" w:cs="Times New Roman"/>
+        </w:rPr>
+        <w:lastRenderedPageBreak/>
+        <w:t>Exceptions exist, so household consolidation should not automatically be applied to every spousal relationship.</w:t>
+      </w:r>
+    </w:p>
+    <w:p>
+      <w:pPr>
+        <w:rPr>
+          <w:rFonts w:ascii="Times New Roman" w:hAnsi="Times New Roman" w:cs="Times New Roman"/>
+        </w:rPr>
+      </w:pPr>
+      <w:r>
+        <w:rPr>
+          <w:rFonts w:ascii="Times New Roman" w:hAnsi="Times New Roman" w:cs="Times New Roman"/>
+        </w:rPr>
+        <w:t>3. Donor Recognition and Benefits</w:t>
+      </w:r>
+    </w:p>
+    <w:p>
+      <w:pPr>
+        <w:rPr>
+          <w:rFonts w:ascii="Times New Roman" w:hAnsi="Times New Roman" w:cs="Times New Roman"/>
+        </w:rPr>
+      </w:pPr>
+      <w:r>
+        <w:rPr>
+          <w:rFonts w:ascii="Times New Roman" w:hAnsi="Times New Roman" w:cs="Times New Roman"/>
+        </w:rPr>
+        <w:t>Depending on giving level or fundraising strategy, donors may receive:</w:t>
+      </w:r>
+    </w:p>
+    <w:p>
+      <w:pPr>
         <w:numPr>
           <w:ilvl w:val="0"/>
-          <w:numId w:val="1"/>
+          <w:numId w:val="7"/>
         </w:numPr>
-      </w:pPr>
-      <w:r>
-        <w:t>Extra perks</w:t>
-      </w:r>
-    </w:p>
-    <w:p>
-      <w:pPr>
-        <w:pStyle w:val="ListParagraph"/>
+        <w:rPr>
+          <w:rFonts w:ascii="Times New Roman" w:hAnsi="Times New Roman" w:cs="Times New Roman"/>
+        </w:rPr>
+      </w:pPr>
+      <w:r>
+        <w:rPr>
+          <w:rFonts w:ascii="Times New Roman" w:hAnsi="Times New Roman" w:cs="Times New Roman"/>
+        </w:rPr>
+        <w:t>Acknowledgement or recognition.</w:t>
+      </w:r>
+    </w:p>
+    <w:p>
+      <w:pPr>
         <w:numPr>
           <w:ilvl w:val="0"/>
-          <w:numId w:val="1"/>
+          <w:numId w:val="7"/>
         </w:numPr>
-      </w:pPr>
-      <w:r>
-        <w:t>Invitations to events</w:t>
-      </w:r>
-    </w:p>
-    <w:p>
-      <w:pPr>
-        <w:pStyle w:val="ListParagraph"/>
+        <w:rPr>
+          <w:rFonts w:ascii="Times New Roman" w:hAnsi="Times New Roman" w:cs="Times New Roman"/>
+        </w:rPr>
+      </w:pPr>
+      <w:r>
+        <w:rPr>
+          <w:rFonts w:ascii="Times New Roman" w:hAnsi="Times New Roman" w:cs="Times New Roman"/>
+        </w:rPr>
+        <w:t>Additional donor benefits or perks.</w:t>
+      </w:r>
+    </w:p>
+    <w:p>
+      <w:pPr>
         <w:numPr>
           <w:ilvl w:val="0"/>
-          <w:numId w:val="1"/>
+          <w:numId w:val="7"/>
         </w:numPr>
-      </w:pPr>
-      <w:r>
-        <w:t>SWAG (e.g. tote bags)</w:t>
-      </w:r>
-    </w:p>
-    <w:p/>
-    <w:p>
-      <w:pPr>
-        <w:rPr>
-          <w:b/>
-          <w:bCs/>
-        </w:rPr>
-      </w:pPr>
-      <w:r>
-        <w:rPr>
-          <w:b/>
-          <w:bCs/>
-        </w:rPr>
-        <w:t xml:space="preserve">Source of Money for Grant </w:t>
-      </w:r>
-      <w:r>
-        <w:rPr>
-          <w:b/>
-          <w:bCs/>
-        </w:rPr>
-        <w:t>Matching</w:t>
-      </w:r>
-      <w:r>
-        <w:rPr>
-          <w:b/>
-          <w:bCs/>
-        </w:rPr>
-        <w:t xml:space="preserve"> </w:t>
-      </w:r>
-    </w:p>
-    <w:p>
-      <w:pPr>
-        <w:pStyle w:val="ListParagraph"/>
+        <w:rPr>
+          <w:rFonts w:ascii="Times New Roman" w:hAnsi="Times New Roman" w:cs="Times New Roman"/>
+        </w:rPr>
+      </w:pPr>
+      <w:r>
+        <w:rPr>
+          <w:rFonts w:ascii="Times New Roman" w:hAnsi="Times New Roman" w:cs="Times New Roman"/>
+        </w:rPr>
+        <w:t>Invitations to events.</w:t>
+      </w:r>
+    </w:p>
+    <w:p>
+      <w:pPr>
         <w:numPr>
           <w:ilvl w:val="0"/>
-          <w:numId w:val="1"/>
+          <w:numId w:val="7"/>
         </w:numPr>
         <w:rPr>
-          <w:b/>
-          <w:bCs/>
-        </w:rPr>
-      </w:pPr>
-      <w:r>
-        <w:t xml:space="preserve">Past: </w:t>
-      </w:r>
-    </w:p>
-    <w:p>
-      <w:pPr>
-        <w:pStyle w:val="ListParagraph"/>
+          <w:rFonts w:ascii="Times New Roman" w:hAnsi="Times New Roman" w:cs="Times New Roman"/>
+        </w:rPr>
+      </w:pPr>
+      <w:r>
+        <w:rPr>
+          <w:rFonts w:ascii="Times New Roman" w:hAnsi="Times New Roman" w:cs="Times New Roman"/>
+        </w:rPr>
+        <w:t>Promotional items or SWAG, such as tote bags.</w:t>
+      </w:r>
+    </w:p>
+    <w:p>
+      <w:pPr>
+        <w:rPr>
+          <w:rFonts w:ascii="Times New Roman" w:hAnsi="Times New Roman" w:cs="Times New Roman"/>
+        </w:rPr>
+      </w:pPr>
+      <w:r>
+        <w:rPr>
+          <w:rFonts w:ascii="Times New Roman" w:hAnsi="Times New Roman" w:cs="Times New Roman"/>
+        </w:rPr>
+        <w:t>These benefits may provide useful context for donor segmentation but are not currently a primary analytical objective.</w:t>
+      </w:r>
+    </w:p>
+    <w:p>
+      <w:pPr>
+        <w:rPr>
+          <w:rFonts w:ascii="Times New Roman" w:hAnsi="Times New Roman" w:cs="Times New Roman"/>
+        </w:rPr>
+      </w:pPr>
+      <w:r>
+        <w:rPr>
+          <w:rFonts w:ascii="Times New Roman" w:hAnsi="Times New Roman" w:cs="Times New Roman"/>
+        </w:rPr>
+        <w:t>4. Grant-Matching Context</w:t>
+      </w:r>
+    </w:p>
+    <w:p>
+      <w:pPr>
+        <w:rPr>
+          <w:rFonts w:ascii="Times New Roman" w:hAnsi="Times New Roman" w:cs="Times New Roman"/>
+        </w:rPr>
+      </w:pPr>
+      <w:r>
+        <w:rPr>
+          <w:rFonts w:ascii="Times New Roman" w:hAnsi="Times New Roman" w:cs="Times New Roman"/>
+        </w:rPr>
+        <w:t>Historical Approach</w:t>
+      </w:r>
+    </w:p>
+    <w:p>
+      <w:pPr>
+        <w:numPr>
+          <w:ilvl w:val="0"/>
+          <w:numId w:val="8"/>
+        </w:numPr>
+        <w:rPr>
+          <w:rFonts w:ascii="Times New Roman" w:hAnsi="Times New Roman" w:cs="Times New Roman"/>
+        </w:rPr>
+      </w:pPr>
+      <w:r>
+        <w:rPr>
+          <w:rFonts w:ascii="Times New Roman" w:hAnsi="Times New Roman" w:cs="Times New Roman"/>
+        </w:rPr>
+        <w:t>Matching funds previously often came from corporations.</w:t>
+      </w:r>
+    </w:p>
+    <w:p>
+      <w:pPr>
+        <w:numPr>
+          <w:ilvl w:val="0"/>
+          <w:numId w:val="8"/>
+        </w:numPr>
+        <w:rPr>
+          <w:rFonts w:ascii="Times New Roman" w:hAnsi="Times New Roman" w:cs="Times New Roman"/>
+        </w:rPr>
+      </w:pPr>
+      <w:r>
+        <w:rPr>
+          <w:rFonts w:ascii="Times New Roman" w:hAnsi="Times New Roman" w:cs="Times New Roman"/>
+        </w:rPr>
+        <w:t>Corporate partners sometimes provided additional support, such as staff members answering phones during fundraising campaigns.</w:t>
+      </w:r>
+    </w:p>
+    <w:p>
+      <w:pPr>
+        <w:rPr>
+          <w:rFonts w:ascii="Times New Roman" w:hAnsi="Times New Roman" w:cs="Times New Roman"/>
+        </w:rPr>
+      </w:pPr>
+      <w:r>
+        <w:rPr>
+          <w:rFonts w:ascii="Times New Roman" w:hAnsi="Times New Roman" w:cs="Times New Roman"/>
+        </w:rPr>
+        <w:t>Current Approach</w:t>
+      </w:r>
+    </w:p>
+    <w:p>
+      <w:pPr>
+        <w:numPr>
+          <w:ilvl w:val="0"/>
+          <w:numId w:val="9"/>
+        </w:numPr>
+        <w:rPr>
+          <w:rFonts w:ascii="Times New Roman" w:hAnsi="Times New Roman" w:cs="Times New Roman"/>
+        </w:rPr>
+      </w:pPr>
+      <w:r>
+        <w:rPr>
+          <w:rFonts w:ascii="Times New Roman" w:hAnsi="Times New Roman" w:cs="Times New Roman"/>
+        </w:rPr>
+        <w:t>Matching funds now commonly come from bequests or donor-designated funds.</w:t>
+      </w:r>
+    </w:p>
+    <w:p>
+      <w:pPr>
+        <w:numPr>
+          <w:ilvl w:val="0"/>
+          <w:numId w:val="9"/>
+        </w:numPr>
+        <w:rPr>
+          <w:rFonts w:ascii="Times New Roman" w:hAnsi="Times New Roman" w:cs="Times New Roman"/>
+        </w:rPr>
+      </w:pPr>
+      <w:r>
+        <w:rPr>
+          <w:rFonts w:ascii="Times New Roman" w:hAnsi="Times New Roman" w:cs="Times New Roman"/>
+        </w:rPr>
+        <w:t>For example, a deceased donor may have specified that funds should be used to match future donations.</w:t>
+      </w:r>
+    </w:p>
+    <w:p>
+      <w:pPr>
+        <w:rPr>
+          <w:rFonts w:ascii="Times New Roman" w:hAnsi="Times New Roman" w:cs="Times New Roman"/>
+        </w:rPr>
+      </w:pPr>
+      <w:r>
+        <w:rPr>
+          <w:rFonts w:ascii="Times New Roman" w:hAnsi="Times New Roman" w:cs="Times New Roman"/>
+        </w:rPr>
+        <w:t>5. Data Cleaning and Business Rules</w:t>
+      </w:r>
+    </w:p>
+    <w:p>
+      <w:pPr>
+        <w:rPr>
+          <w:rFonts w:ascii="Times New Roman" w:hAnsi="Times New Roman" w:cs="Times New Roman"/>
+        </w:rPr>
+      </w:pPr>
+      <w:r>
+        <w:rPr>
+          <w:rFonts w:ascii="Times New Roman" w:hAnsi="Times New Roman" w:cs="Times New Roman"/>
+        </w:rPr>
+        <w:t>unite_payments.csv</w:t>
+      </w:r>
+    </w:p>
+    <w:p>
+      <w:pPr>
+        <w:numPr>
+          <w:ilvl w:val="0"/>
+          <w:numId w:val="10"/>
+        </w:numPr>
+        <w:rPr>
+          <w:rFonts w:ascii="Times New Roman" w:hAnsi="Times New Roman" w:cs="Times New Roman"/>
+        </w:rPr>
+      </w:pPr>
+      <w:r>
+        <w:rPr>
+          <w:rFonts w:ascii="Times New Roman" w:hAnsi="Times New Roman" w:cs="Times New Roman"/>
+        </w:rPr>
+        <w:t>Exclude payments with an amount of $0 from donation calculations.</w:t>
+      </w:r>
+    </w:p>
+    <w:p>
+      <w:pPr>
+        <w:rPr>
+          <w:rFonts w:ascii="Times New Roman" w:hAnsi="Times New Roman" w:cs="Times New Roman"/>
+        </w:rPr>
+      </w:pPr>
+      <w:r>
+        <w:rPr>
+          <w:rFonts w:ascii="Times New Roman" w:hAnsi="Times New Roman" w:cs="Times New Roman"/>
+        </w:rPr>
+        <w:t>team_approach_legacy_payments.csv</w:t>
+      </w:r>
+    </w:p>
+    <w:p>
+      <w:pPr>
+        <w:numPr>
+          <w:ilvl w:val="0"/>
+          <w:numId w:val="11"/>
+        </w:numPr>
+        <w:rPr>
+          <w:rFonts w:ascii="Times New Roman" w:hAnsi="Times New Roman" w:cs="Times New Roman"/>
+        </w:rPr>
+      </w:pPr>
+      <w:r>
+        <w:rPr>
+          <w:rFonts w:ascii="Times New Roman" w:hAnsi="Times New Roman" w:cs="Times New Roman"/>
+        </w:rPr>
+        <w:t>The source description "a" is a data error or legacy coding issue.</w:t>
+      </w:r>
+    </w:p>
+    <w:p>
+      <w:pPr>
+        <w:numPr>
+          <w:ilvl w:val="0"/>
+          <w:numId w:val="11"/>
+        </w:numPr>
+        <w:rPr>
+          <w:rFonts w:ascii="Times New Roman" w:hAnsi="Times New Roman" w:cs="Times New Roman"/>
+        </w:rPr>
+      </w:pPr>
+      <w:r>
+        <w:rPr>
+          <w:rFonts w:ascii="Times New Roman" w:hAnsi="Times New Roman" w:cs="Times New Roman"/>
+        </w:rPr>
+        <w:t>"a" should be interpreted as annual.</w:t>
+      </w:r>
+    </w:p>
+    <w:p>
+      <w:pPr>
+        <w:rPr>
+          <w:rFonts w:ascii="Times New Roman" w:hAnsi="Times New Roman" w:cs="Times New Roman"/>
+        </w:rPr>
+      </w:pPr>
+      <w:r>
+        <w:rPr>
+          <w:rFonts w:ascii="Times New Roman" w:hAnsi="Times New Roman" w:cs="Times New Roman"/>
+        </w:rPr>
+        <w:t>Giving Frequency</w:t>
+      </w:r>
+    </w:p>
+    <w:p>
+      <w:pPr>
+        <w:numPr>
+          <w:ilvl w:val="0"/>
+          <w:numId w:val="12"/>
+        </w:numPr>
+        <w:rPr>
+          <w:rFonts w:ascii="Times New Roman" w:hAnsi="Times New Roman" w:cs="Times New Roman"/>
+        </w:rPr>
+      </w:pPr>
+      <w:r>
+        <w:rPr>
+          <w:rFonts w:ascii="Times New Roman" w:hAnsi="Times New Roman" w:cs="Times New Roman"/>
+        </w:rPr>
+        <w:t>Preserve information that allows donors to be classified as one-time, recurring, or otherwise continual donors.</w:t>
+      </w:r>
+    </w:p>
+    <w:p>
+      <w:pPr>
+        <w:numPr>
+          <w:ilvl w:val="0"/>
+          <w:numId w:val="12"/>
+        </w:numPr>
+        <w:rPr>
+          <w:rFonts w:ascii="Times New Roman" w:hAnsi="Times New Roman" w:cs="Times New Roman"/>
+        </w:rPr>
+      </w:pPr>
+      <w:r>
+        <w:rPr>
+          <w:rFonts w:ascii="Times New Roman" w:hAnsi="Times New Roman" w:cs="Times New Roman"/>
+        </w:rPr>
+        <w:t>Recurring giving should be aggregated when calculating annual donor value.</w:t>
+      </w:r>
+    </w:p>
+    <w:p>
+      <w:pPr>
+        <w:rPr>
+          <w:rFonts w:ascii="Times New Roman" w:hAnsi="Times New Roman" w:cs="Times New Roman"/>
+        </w:rPr>
+      </w:pPr>
+      <w:r>
+        <w:rPr>
+          <w:rFonts w:ascii="Times New Roman" w:hAnsi="Times New Roman" w:cs="Times New Roman"/>
+        </w:rPr>
+        <w:lastRenderedPageBreak/>
+        <w:t>6. Data Integration</w:t>
+      </w:r>
+    </w:p>
+    <w:p>
+      <w:pPr>
+        <w:numPr>
+          <w:ilvl w:val="0"/>
+          <w:numId w:val="13"/>
+        </w:numPr>
+        <w:rPr>
+          <w:rFonts w:ascii="Times New Roman" w:hAnsi="Times New Roman" w:cs="Times New Roman"/>
+        </w:rPr>
+      </w:pPr>
+      <w:r>
+        <w:rPr>
+          <w:rFonts w:ascii="Times New Roman" w:hAnsi="Times New Roman" w:cs="Times New Roman"/>
+        </w:rPr>
+        <w:t>Review available documentation for joining team_approach_legacy_payments.csv with unite_payments.csv.</w:t>
+      </w:r>
+    </w:p>
+    <w:p>
+      <w:pPr>
+        <w:numPr>
+          <w:ilvl w:val="0"/>
+          <w:numId w:val="13"/>
+        </w:numPr>
+        <w:rPr>
+          <w:rFonts w:ascii="Times New Roman" w:hAnsi="Times New Roman" w:cs="Times New Roman"/>
+        </w:rPr>
+      </w:pPr>
+      <w:r>
+        <w:rPr>
+          <w:rFonts w:ascii="Times New Roman" w:hAnsi="Times New Roman" w:cs="Times New Roman"/>
+        </w:rPr>
+        <w:t xml:space="preserve">Review documentation and business rules before performing more advanced </w:t>
+      </w:r>
+      <w:proofErr w:type="gramStart"/>
+      <w:r>
+        <w:rPr>
+          <w:rFonts w:ascii="Times New Roman" w:hAnsi="Times New Roman" w:cs="Times New Roman"/>
+        </w:rPr>
+        <w:t>joins</w:t>
+      </w:r>
+      <w:proofErr w:type="gramEnd"/>
+      <w:r>
+        <w:rPr>
+          <w:rFonts w:ascii="Times New Roman" w:hAnsi="Times New Roman" w:cs="Times New Roman"/>
+        </w:rPr>
+        <w:t xml:space="preserve"> across constituent datasets.</w:t>
+      </w:r>
+    </w:p>
+    <w:p>
+      <w:pPr>
+        <w:numPr>
+          <w:ilvl w:val="0"/>
+          <w:numId w:val="13"/>
+        </w:numPr>
+        <w:rPr>
+          <w:rFonts w:ascii="Times New Roman" w:hAnsi="Times New Roman" w:cs="Times New Roman"/>
+        </w:rPr>
+      </w:pPr>
+      <w:r>
+        <w:rPr>
+          <w:rFonts w:ascii="Times New Roman" w:hAnsi="Times New Roman" w:cs="Times New Roman"/>
+        </w:rPr>
+        <w:t>Ensure historical Team Approach data and current Unite data can be combined without:</w:t>
+      </w:r>
+    </w:p>
+    <w:p>
+      <w:pPr>
         <w:numPr>
           <w:ilvl w:val="1"/>
-          <w:numId w:val="1"/>
+          <w:numId w:val="13"/>
         </w:numPr>
         <w:rPr>
-          <w:b/>
-          <w:bCs/>
-        </w:rPr>
-      </w:pPr>
-      <w:r>
-        <w:t>Funding to match donors used to come from corporations</w:t>
-      </w:r>
-    </w:p>
-    <w:p>
-      <w:pPr>
-        <w:pStyle w:val="ListParagraph"/>
+          <w:rFonts w:ascii="Times New Roman" w:hAnsi="Times New Roman" w:cs="Times New Roman"/>
+        </w:rPr>
+      </w:pPr>
+      <w:r>
+        <w:rPr>
+          <w:rFonts w:ascii="Times New Roman" w:hAnsi="Times New Roman" w:cs="Times New Roman"/>
+        </w:rPr>
+        <w:t>Double-counting gifts.</w:t>
+      </w:r>
+    </w:p>
+    <w:p>
+      <w:pPr>
         <w:numPr>
           <w:ilvl w:val="1"/>
-          <w:numId w:val="1"/>
+          <w:numId w:val="13"/>
         </w:numPr>
         <w:rPr>
-          <w:b/>
-          <w:bCs/>
-        </w:rPr>
-      </w:pPr>
-      <w:r>
-        <w:t>Sometimes even t</w:t>
-      </w:r>
-      <w:r>
-        <w:t>heir staff would answer phones</w:t>
-      </w:r>
-    </w:p>
-    <w:p>
-      <w:pPr>
-        <w:pStyle w:val="ListParagraph"/>
+          <w:rFonts w:ascii="Times New Roman" w:hAnsi="Times New Roman" w:cs="Times New Roman"/>
+        </w:rPr>
+      </w:pPr>
+      <w:r>
+        <w:rPr>
+          <w:rFonts w:ascii="Times New Roman" w:hAnsi="Times New Roman" w:cs="Times New Roman"/>
+        </w:rPr>
+        <w:t>Duplicating constituents.</w:t>
+      </w:r>
+    </w:p>
+    <w:p>
+      <w:pPr>
+        <w:numPr>
+          <w:ilvl w:val="1"/>
+          <w:numId w:val="13"/>
+        </w:numPr>
+        <w:rPr>
+          <w:rFonts w:ascii="Times New Roman" w:hAnsi="Times New Roman" w:cs="Times New Roman"/>
+        </w:rPr>
+      </w:pPr>
+      <w:r>
+        <w:rPr>
+          <w:rFonts w:ascii="Times New Roman" w:hAnsi="Times New Roman" w:cs="Times New Roman"/>
+        </w:rPr>
+        <w:t>Incorrectly assigning gifts to households or individuals.</w:t>
+      </w:r>
+    </w:p>
+    <w:p>
+      <w:pPr>
+        <w:rPr>
+          <w:rFonts w:ascii="Times New Roman" w:hAnsi="Times New Roman" w:cs="Times New Roman"/>
+        </w:rPr>
+      </w:pPr>
+      <w:r>
+        <w:rPr>
+          <w:rFonts w:ascii="Times New Roman" w:hAnsi="Times New Roman" w:cs="Times New Roman"/>
+        </w:rPr>
+        <w:t>7. Dataset Considerations</w:t>
+      </w:r>
+    </w:p>
+    <w:p>
+      <w:pPr>
+        <w:rPr>
+          <w:rFonts w:ascii="Times New Roman" w:hAnsi="Times New Roman" w:cs="Times New Roman"/>
+        </w:rPr>
+      </w:pPr>
+      <w:r>
+        <w:rPr>
+          <w:rFonts w:ascii="Times New Roman" w:hAnsi="Times New Roman" w:cs="Times New Roman"/>
+        </w:rPr>
+        <w:t>Campaign Members</w:t>
+      </w:r>
+    </w:p>
+    <w:p>
+      <w:pPr>
         <w:numPr>
           <w:ilvl w:val="0"/>
-          <w:numId w:val="1"/>
+          <w:numId w:val="14"/>
         </w:numPr>
         <w:rPr>
-          <w:b/>
-          <w:bCs/>
-        </w:rPr>
-      </w:pPr>
-      <w:r>
-        <w:t xml:space="preserve">Now: </w:t>
-      </w:r>
-    </w:p>
-    <w:p>
-      <w:pPr>
-        <w:pStyle w:val="ListParagraph"/>
+          <w:rFonts w:ascii="Times New Roman" w:hAnsi="Times New Roman" w:cs="Times New Roman"/>
+        </w:rPr>
+      </w:pPr>
+      <w:r>
+        <w:rPr>
+          <w:rFonts w:ascii="Times New Roman" w:hAnsi="Times New Roman" w:cs="Times New Roman"/>
+        </w:rPr>
+        <w:t>Campaign-member data are large and sparse.</w:t>
+      </w:r>
+    </w:p>
+    <w:p>
+      <w:pPr>
         <w:numPr>
-          <w:ilvl w:val="1"/>
-          <w:numId w:val="1"/>
+          <w:ilvl w:val="0"/>
+          <w:numId w:val="14"/>
         </w:numPr>
         <w:rPr>
-          <w:b/>
-          <w:bCs/>
-        </w:rPr>
-      </w:pPr>
-      <w:r>
-        <w:t>Typically,</w:t>
-      </w:r>
-      <w:r>
-        <w:t xml:space="preserve"> from r</w:t>
-      </w:r>
-      <w:r>
-        <w:t>equests (people who died and wanted their money to be used to match)</w:t>
-      </w:r>
+          <w:rFonts w:ascii="Times New Roman" w:hAnsi="Times New Roman" w:cs="Times New Roman"/>
+        </w:rPr>
+      </w:pPr>
+      <w:r>
+        <w:rPr>
+          <w:rFonts w:ascii="Times New Roman" w:hAnsi="Times New Roman" w:cs="Times New Roman"/>
+        </w:rPr>
+        <w:t>Response information may be limited.</w:t>
+      </w:r>
+    </w:p>
+    <w:p>
+      <w:pPr>
+        <w:numPr>
+          <w:ilvl w:val="0"/>
+          <w:numId w:val="14"/>
+        </w:numPr>
+        <w:rPr>
+          <w:rFonts w:ascii="Times New Roman" w:hAnsi="Times New Roman" w:cs="Times New Roman"/>
+        </w:rPr>
+      </w:pPr>
+      <w:r>
+        <w:rPr>
+          <w:rFonts w:ascii="Times New Roman" w:hAnsi="Times New Roman" w:cs="Times New Roman"/>
+        </w:rPr>
+        <w:t>This dataset may provide less analytical value than donation, membership, capacity, engagement, affiliation, and viewing data.</w:t>
+      </w:r>
+    </w:p>
+    <w:p>
+      <w:pPr>
+        <w:numPr>
+          <w:ilvl w:val="0"/>
+          <w:numId w:val="14"/>
+        </w:numPr>
+        <w:rPr>
+          <w:rFonts w:ascii="Times New Roman" w:hAnsi="Times New Roman" w:cs="Times New Roman"/>
+        </w:rPr>
+      </w:pPr>
+      <w:r>
+        <w:rPr>
+          <w:rFonts w:ascii="Times New Roman" w:hAnsi="Times New Roman" w:cs="Times New Roman"/>
+        </w:rPr>
+        <w:t>Evaluate its usefulness before incorporating it extensively into the final analysis.</w:t>
+      </w:r>
+    </w:p>
+    <w:p>
+      <w:pPr>
+        <w:rPr>
+          <w:rFonts w:ascii="Times New Roman" w:hAnsi="Times New Roman" w:cs="Times New Roman"/>
+        </w:rPr>
+      </w:pPr>
+      <w:r>
+        <w:rPr>
+          <w:rFonts w:ascii="Times New Roman" w:hAnsi="Times New Roman" w:cs="Times New Roman"/>
+        </w:rPr>
+        <w:t>8. Items to Investigate</w:t>
+      </w:r>
+    </w:p>
+    <w:p>
+      <w:pPr>
+        <w:numPr>
+          <w:ilvl w:val="0"/>
+          <w:numId w:val="15"/>
+        </w:numPr>
+        <w:rPr>
+          <w:rFonts w:ascii="Times New Roman" w:hAnsi="Times New Roman" w:cs="Times New Roman"/>
+        </w:rPr>
+      </w:pPr>
+      <w:r>
+        <w:rPr>
+          <w:rFonts w:ascii="Times New Roman" w:hAnsi="Times New Roman" w:cs="Times New Roman"/>
+        </w:rPr>
+        <w:t>Determine the most useful donation-level categories for the dashboard.</w:t>
+      </w:r>
+    </w:p>
+    <w:p>
+      <w:pPr>
+        <w:numPr>
+          <w:ilvl w:val="0"/>
+          <w:numId w:val="15"/>
+        </w:numPr>
+        <w:rPr>
+          <w:rFonts w:ascii="Times New Roman" w:hAnsi="Times New Roman" w:cs="Times New Roman"/>
+        </w:rPr>
+      </w:pPr>
+      <w:r>
+        <w:rPr>
+          <w:rFonts w:ascii="Times New Roman" w:hAnsi="Times New Roman" w:cs="Times New Roman"/>
+        </w:rPr>
+        <w:t>Define the exact business rule for one-time vs. continual/recurring donors.</w:t>
+      </w:r>
+    </w:p>
+    <w:p>
+      <w:pPr>
+        <w:numPr>
+          <w:ilvl w:val="0"/>
+          <w:numId w:val="15"/>
+        </w:numPr>
+        <w:rPr>
+          <w:rFonts w:ascii="Times New Roman" w:hAnsi="Times New Roman" w:cs="Times New Roman"/>
+        </w:rPr>
+      </w:pPr>
+      <w:r>
+        <w:rPr>
+          <w:rFonts w:ascii="Times New Roman" w:hAnsi="Times New Roman" w:cs="Times New Roman"/>
+        </w:rPr>
+        <w:t>Determine how household-level giving should be handled when spouses are linked.</w:t>
+      </w:r>
+    </w:p>
+    <w:p>
+      <w:pPr>
+        <w:numPr>
+          <w:ilvl w:val="0"/>
+          <w:numId w:val="15"/>
+        </w:numPr>
+        <w:rPr>
+          <w:rFonts w:ascii="Times New Roman" w:hAnsi="Times New Roman" w:cs="Times New Roman"/>
+        </w:rPr>
+      </w:pPr>
+      <w:r>
+        <w:rPr>
+          <w:rFonts w:ascii="Times New Roman" w:hAnsi="Times New Roman" w:cs="Times New Roman"/>
+        </w:rPr>
+        <w:t>Evaluate whether campaign-member data add meaningful predictive or segmentation value.</w:t>
+      </w:r>
+    </w:p>
+    <w:p>
+      <w:pPr>
+        <w:numPr>
+          <w:ilvl w:val="0"/>
+          <w:numId w:val="15"/>
+        </w:numPr>
+        <w:rPr>
+          <w:rFonts w:ascii="Times New Roman" w:hAnsi="Times New Roman" w:cs="Times New Roman"/>
+        </w:rPr>
+      </w:pPr>
+      <w:r>
+        <w:rPr>
+          <w:rFonts w:ascii="Times New Roman" w:hAnsi="Times New Roman" w:cs="Times New Roman"/>
+        </w:rPr>
+        <w:t>Confirm the appropriate treatment of matching gifts and their relationship to individual donor behavior.</w:t>
+      </w:r>
+    </w:p>
+    <w:p>
+      <w:pPr>
+        <w:numPr>
+          <w:ilvl w:val="0"/>
+          <w:numId w:val="15"/>
+        </w:numPr>
+        <w:rPr>
+          <w:rFonts w:ascii="Times New Roman" w:hAnsi="Times New Roman" w:cs="Times New Roman"/>
+        </w:rPr>
+      </w:pPr>
+      <w:r>
+        <w:rPr>
+          <w:rFonts w:ascii="Times New Roman" w:hAnsi="Times New Roman" w:cs="Times New Roman"/>
+        </w:rPr>
+        <w:t>Examine the July 2025 donation spike and determine how it should be represented when analyzing historical donor behavior.</w:t>
+      </w:r>
+    </w:p>
+    <w:p>
+      <w:pPr>
+        <w:rPr>
+          <w:rFonts w:ascii="Times New Roman" w:hAnsi="Times New Roman" w:cs="Times New Roman"/>
+        </w:rPr>
+      </w:pPr>
     </w:p>
     <w:sectPr>
       <w:pgSz w:w="12240" w:h="15840"/>
@@ -344,6 +1120,751 @@
 <file path=word/numbering.xml><?xml version="1.0" encoding="utf-8"?>
 <w:numbering xmlns:wpc="http://schemas.microsoft.com/office/word/2010/wordprocessingCanvas" xmlns:cx="http://schemas.microsoft.com/office/drawing/2014/chartex" xmlns:cx1="http://schemas.microsoft.com/office/drawing/2015/9/8/chartex" xmlns:cx2="http://schemas.microsoft.com/office/drawing/2015/10/21/chartex" xmlns:cx3="http://schemas.microsoft.com/office/drawing/2016/5/9/chartex" xmlns:cx4="http://schemas.microsoft.com/office/drawing/2016/5/10/chartex" xmlns:cx5="http://schemas.microsoft.com/office/drawing/2016/5/11/chartex" xmlns:cx6="http://schemas.microsoft.com/office/drawing/2016/5/12/chartex" xmlns:cx7="http://schemas.microsoft.com/office/drawing/2016/5/13/chartex" xmlns:cx8="http://schemas.microsoft.com/office/drawing/2016/5/14/chartex" xmlns:mc="http://schemas.openxmlformats.org/markup-compatibility/2006" xmlns:aink="http://schemas.microsoft.com/office/drawing/2016/ink" xmlns:am3d="http://schemas.microsoft.com/office/drawing/2017/model3d" xmlns:o="urn:schemas-microsoft-com:office:office" xmlns:oel="http://schemas.microsoft.com/office/2019/extlst" xmlns:r="http://schemas.openxmlformats.org/officeDocument/2006/relationships" xmlns:m="http://schemas.openxmlformats.org/officeDocument/2006/math" xmlns:v="urn:schemas-microsoft-com:vml" xmlns:wp14="http://schemas.microsoft.com/office/word/2010/wordprocessingDrawing" xmlns:wp="http://schemas.openxmlformats.org/drawingml/2006/wordprocessingDrawing" xmlns:w10="urn:schemas-microsoft-com:office:word" xmlns:w="http://schemas.openxmlformats.org/wordprocessingml/2006/main" xmlns:w14="http://schemas.microsoft.com/office/word/2010/wordml" xmlns:w15="http://schemas.microsoft.com/office/word/2012/wordml" xmlns:w16cex="http://schemas.microsoft.com/office/word/2018/wordml/cex" xmlns:w16cid="http://schemas.microsoft.com/office/word/2016/wordml/cid" xmlns:w16="http://schemas.microsoft.com/office/word/2018/wordml" xmlns:w16du="http://schemas.microsoft.com/office/word/2023/wordml/word16du" xmlns:w16sdtdh="http://schemas.microsoft.com/office/word/2020/wordml/sdtdatahash" xmlns:w16sdtfl="http://schemas.microsoft.com/office/word/2024/wordml/sdtformatlock" xmlns:w16se="http://schemas.microsoft.com/office/word/2015/wordml/symex" xmlns:wpg="http://schemas.microsoft.com/office/word/2010/wordprocessingGroup" xmlns:wpi="http://schemas.microsoft.com/office/word/2010/wordprocessingInk" xmlns:wne="http://schemas.microsoft.com/office/word/2006/wordml" xmlns:wps="http://schemas.microsoft.com/office/word/2010/wordprocessingShape" mc:Ignorable="w14 w15 w16se w16cid w16 w16cex w16sdtdh w16sdtfl w16du wp14">
   <w:abstractNum w:abstractNumId="0" w15:restartNumberingAfterBreak="0">
+    <w:nsid w:val="029249EB"/>
+    <w:multiLevelType w:val="multilevel"/>
+    <w:tmpl w:val="1922A5C4"/>
+    <w:lvl w:ilvl="0">
+      <w:start w:val="1"/>
+      <w:numFmt w:val="bullet"/>
+      <w:lvlText w:val=""/>
+      <w:lvlJc w:val="left"/>
+      <w:pPr>
+        <w:tabs>
+          <w:tab w:val="num" w:pos="720"/>
+        </w:tabs>
+        <w:ind w:left="720" w:hanging="360"/>
+      </w:pPr>
+      <w:rPr>
+        <w:rFonts w:ascii="Symbol" w:hAnsi="Symbol" w:hint="default"/>
+        <w:sz w:val="20"/>
+      </w:rPr>
+    </w:lvl>
+    <w:lvl w:ilvl="1" w:tentative="1">
+      <w:start w:val="1"/>
+      <w:numFmt w:val="bullet"/>
+      <w:lvlText w:val="o"/>
+      <w:lvlJc w:val="left"/>
+      <w:pPr>
+        <w:tabs>
+          <w:tab w:val="num" w:pos="1440"/>
+        </w:tabs>
+        <w:ind w:left="1440" w:hanging="360"/>
+      </w:pPr>
+      <w:rPr>
+        <w:rFonts w:ascii="Courier New" w:hAnsi="Courier New" w:hint="default"/>
+        <w:sz w:val="20"/>
+      </w:rPr>
+    </w:lvl>
+    <w:lvl w:ilvl="2" w:tentative="1">
+      <w:start w:val="1"/>
+      <w:numFmt w:val="bullet"/>
+      <w:lvlText w:val=""/>
+      <w:lvlJc w:val="left"/>
+      <w:pPr>
+        <w:tabs>
+          <w:tab w:val="num" w:pos="2160"/>
+        </w:tabs>
+        <w:ind w:left="2160" w:hanging="360"/>
+      </w:pPr>
+      <w:rPr>
+        <w:rFonts w:ascii="Wingdings" w:hAnsi="Wingdings" w:hint="default"/>
+        <w:sz w:val="20"/>
+      </w:rPr>
+    </w:lvl>
+    <w:lvl w:ilvl="3" w:tentative="1">
+      <w:start w:val="1"/>
+      <w:numFmt w:val="bullet"/>
+      <w:lvlText w:val=""/>
+      <w:lvlJc w:val="left"/>
+      <w:pPr>
+        <w:tabs>
+          <w:tab w:val="num" w:pos="2880"/>
+        </w:tabs>
+        <w:ind w:left="2880" w:hanging="360"/>
+      </w:pPr>
+      <w:rPr>
+        <w:rFonts w:ascii="Wingdings" w:hAnsi="Wingdings" w:hint="default"/>
+        <w:sz w:val="20"/>
+      </w:rPr>
+    </w:lvl>
+    <w:lvl w:ilvl="4" w:tentative="1">
+      <w:start w:val="1"/>
+      <w:numFmt w:val="bullet"/>
+      <w:lvlText w:val=""/>
+      <w:lvlJc w:val="left"/>
+      <w:pPr>
+        <w:tabs>
+          <w:tab w:val="num" w:pos="3600"/>
+        </w:tabs>
+        <w:ind w:left="3600" w:hanging="360"/>
+      </w:pPr>
+      <w:rPr>
+        <w:rFonts w:ascii="Wingdings" w:hAnsi="Wingdings" w:hint="default"/>
+        <w:sz w:val="20"/>
+      </w:rPr>
+    </w:lvl>
+    <w:lvl w:ilvl="5" w:tentative="1">
+      <w:start w:val="1"/>
+      <w:numFmt w:val="bullet"/>
+      <w:lvlText w:val=""/>
+      <w:lvlJc w:val="left"/>
+      <w:pPr>
+        <w:tabs>
+          <w:tab w:val="num" w:pos="4320"/>
+        </w:tabs>
+        <w:ind w:left="4320" w:hanging="360"/>
+      </w:pPr>
+      <w:rPr>
+        <w:rFonts w:ascii="Wingdings" w:hAnsi="Wingdings" w:hint="default"/>
+        <w:sz w:val="20"/>
+      </w:rPr>
+    </w:lvl>
+    <w:lvl w:ilvl="6" w:tentative="1">
+      <w:start w:val="1"/>
+      <w:numFmt w:val="bullet"/>
+      <w:lvlText w:val=""/>
+      <w:lvlJc w:val="left"/>
+      <w:pPr>
+        <w:tabs>
+          <w:tab w:val="num" w:pos="5040"/>
+        </w:tabs>
+        <w:ind w:left="5040" w:hanging="360"/>
+      </w:pPr>
+      <w:rPr>
+        <w:rFonts w:ascii="Wingdings" w:hAnsi="Wingdings" w:hint="default"/>
+        <w:sz w:val="20"/>
+      </w:rPr>
+    </w:lvl>
+    <w:lvl w:ilvl="7" w:tentative="1">
+      <w:start w:val="1"/>
+      <w:numFmt w:val="bullet"/>
+      <w:lvlText w:val=""/>
+      <w:lvlJc w:val="left"/>
+      <w:pPr>
+        <w:tabs>
+          <w:tab w:val="num" w:pos="5760"/>
+        </w:tabs>
+        <w:ind w:left="5760" w:hanging="360"/>
+      </w:pPr>
+      <w:rPr>
+        <w:rFonts w:ascii="Wingdings" w:hAnsi="Wingdings" w:hint="default"/>
+        <w:sz w:val="20"/>
+      </w:rPr>
+    </w:lvl>
+    <w:lvl w:ilvl="8" w:tentative="1">
+      <w:start w:val="1"/>
+      <w:numFmt w:val="bullet"/>
+      <w:lvlText w:val=""/>
+      <w:lvlJc w:val="left"/>
+      <w:pPr>
+        <w:tabs>
+          <w:tab w:val="num" w:pos="6480"/>
+        </w:tabs>
+        <w:ind w:left="6480" w:hanging="360"/>
+      </w:pPr>
+      <w:rPr>
+        <w:rFonts w:ascii="Wingdings" w:hAnsi="Wingdings" w:hint="default"/>
+        <w:sz w:val="20"/>
+      </w:rPr>
+    </w:lvl>
+  </w:abstractNum>
+  <w:abstractNum w:abstractNumId="1" w15:restartNumberingAfterBreak="0">
+    <w:nsid w:val="06CC5E50"/>
+    <w:multiLevelType w:val="multilevel"/>
+    <w:tmpl w:val="F8CAF7C8"/>
+    <w:lvl w:ilvl="0">
+      <w:start w:val="1"/>
+      <w:numFmt w:val="bullet"/>
+      <w:lvlText w:val=""/>
+      <w:lvlJc w:val="left"/>
+      <w:pPr>
+        <w:tabs>
+          <w:tab w:val="num" w:pos="720"/>
+        </w:tabs>
+        <w:ind w:left="720" w:hanging="360"/>
+      </w:pPr>
+      <w:rPr>
+        <w:rFonts w:ascii="Symbol" w:hAnsi="Symbol" w:hint="default"/>
+        <w:sz w:val="20"/>
+      </w:rPr>
+    </w:lvl>
+    <w:lvl w:ilvl="1" w:tentative="1">
+      <w:start w:val="1"/>
+      <w:numFmt w:val="bullet"/>
+      <w:lvlText w:val="o"/>
+      <w:lvlJc w:val="left"/>
+      <w:pPr>
+        <w:tabs>
+          <w:tab w:val="num" w:pos="1440"/>
+        </w:tabs>
+        <w:ind w:left="1440" w:hanging="360"/>
+      </w:pPr>
+      <w:rPr>
+        <w:rFonts w:ascii="Courier New" w:hAnsi="Courier New" w:hint="default"/>
+        <w:sz w:val="20"/>
+      </w:rPr>
+    </w:lvl>
+    <w:lvl w:ilvl="2" w:tentative="1">
+      <w:start w:val="1"/>
+      <w:numFmt w:val="bullet"/>
+      <w:lvlText w:val=""/>
+      <w:lvlJc w:val="left"/>
+      <w:pPr>
+        <w:tabs>
+          <w:tab w:val="num" w:pos="2160"/>
+        </w:tabs>
+        <w:ind w:left="2160" w:hanging="360"/>
+      </w:pPr>
+      <w:rPr>
+        <w:rFonts w:ascii="Wingdings" w:hAnsi="Wingdings" w:hint="default"/>
+        <w:sz w:val="20"/>
+      </w:rPr>
+    </w:lvl>
+    <w:lvl w:ilvl="3" w:tentative="1">
+      <w:start w:val="1"/>
+      <w:numFmt w:val="bullet"/>
+      <w:lvlText w:val=""/>
+      <w:lvlJc w:val="left"/>
+      <w:pPr>
+        <w:tabs>
+          <w:tab w:val="num" w:pos="2880"/>
+        </w:tabs>
+        <w:ind w:left="2880" w:hanging="360"/>
+      </w:pPr>
+      <w:rPr>
+        <w:rFonts w:ascii="Wingdings" w:hAnsi="Wingdings" w:hint="default"/>
+        <w:sz w:val="20"/>
+      </w:rPr>
+    </w:lvl>
+    <w:lvl w:ilvl="4" w:tentative="1">
+      <w:start w:val="1"/>
+      <w:numFmt w:val="bullet"/>
+      <w:lvlText w:val=""/>
+      <w:lvlJc w:val="left"/>
+      <w:pPr>
+        <w:tabs>
+          <w:tab w:val="num" w:pos="3600"/>
+        </w:tabs>
+        <w:ind w:left="3600" w:hanging="360"/>
+      </w:pPr>
+      <w:rPr>
+        <w:rFonts w:ascii="Wingdings" w:hAnsi="Wingdings" w:hint="default"/>
+        <w:sz w:val="20"/>
+      </w:rPr>
+    </w:lvl>
+    <w:lvl w:ilvl="5" w:tentative="1">
+      <w:start w:val="1"/>
+      <w:numFmt w:val="bullet"/>
+      <w:lvlText w:val=""/>
+      <w:lvlJc w:val="left"/>
+      <w:pPr>
+        <w:tabs>
+          <w:tab w:val="num" w:pos="4320"/>
+        </w:tabs>
+        <w:ind w:left="4320" w:hanging="360"/>
+      </w:pPr>
+      <w:rPr>
+        <w:rFonts w:ascii="Wingdings" w:hAnsi="Wingdings" w:hint="default"/>
+        <w:sz w:val="20"/>
+      </w:rPr>
+    </w:lvl>
+    <w:lvl w:ilvl="6" w:tentative="1">
+      <w:start w:val="1"/>
+      <w:numFmt w:val="bullet"/>
+      <w:lvlText w:val=""/>
+      <w:lvlJc w:val="left"/>
+      <w:pPr>
+        <w:tabs>
+          <w:tab w:val="num" w:pos="5040"/>
+        </w:tabs>
+        <w:ind w:left="5040" w:hanging="360"/>
+      </w:pPr>
+      <w:rPr>
+        <w:rFonts w:ascii="Wingdings" w:hAnsi="Wingdings" w:hint="default"/>
+        <w:sz w:val="20"/>
+      </w:rPr>
+    </w:lvl>
+    <w:lvl w:ilvl="7" w:tentative="1">
+      <w:start w:val="1"/>
+      <w:numFmt w:val="bullet"/>
+      <w:lvlText w:val=""/>
+      <w:lvlJc w:val="left"/>
+      <w:pPr>
+        <w:tabs>
+          <w:tab w:val="num" w:pos="5760"/>
+        </w:tabs>
+        <w:ind w:left="5760" w:hanging="360"/>
+      </w:pPr>
+      <w:rPr>
+        <w:rFonts w:ascii="Wingdings" w:hAnsi="Wingdings" w:hint="default"/>
+        <w:sz w:val="20"/>
+      </w:rPr>
+    </w:lvl>
+    <w:lvl w:ilvl="8" w:tentative="1">
+      <w:start w:val="1"/>
+      <w:numFmt w:val="bullet"/>
+      <w:lvlText w:val=""/>
+      <w:lvlJc w:val="left"/>
+      <w:pPr>
+        <w:tabs>
+          <w:tab w:val="num" w:pos="6480"/>
+        </w:tabs>
+        <w:ind w:left="6480" w:hanging="360"/>
+      </w:pPr>
+      <w:rPr>
+        <w:rFonts w:ascii="Wingdings" w:hAnsi="Wingdings" w:hint="default"/>
+        <w:sz w:val="20"/>
+      </w:rPr>
+    </w:lvl>
+  </w:abstractNum>
+  <w:abstractNum w:abstractNumId="2" w15:restartNumberingAfterBreak="0">
+    <w:nsid w:val="0CDD2BC2"/>
+    <w:multiLevelType w:val="multilevel"/>
+    <w:tmpl w:val="B8BA3592"/>
+    <w:lvl w:ilvl="0">
+      <w:start w:val="1"/>
+      <w:numFmt w:val="bullet"/>
+      <w:lvlText w:val=""/>
+      <w:lvlJc w:val="left"/>
+      <w:pPr>
+        <w:tabs>
+          <w:tab w:val="num" w:pos="720"/>
+        </w:tabs>
+        <w:ind w:left="720" w:hanging="360"/>
+      </w:pPr>
+      <w:rPr>
+        <w:rFonts w:ascii="Symbol" w:hAnsi="Symbol" w:hint="default"/>
+        <w:sz w:val="20"/>
+      </w:rPr>
+    </w:lvl>
+    <w:lvl w:ilvl="1" w:tentative="1">
+      <w:start w:val="1"/>
+      <w:numFmt w:val="bullet"/>
+      <w:lvlText w:val="o"/>
+      <w:lvlJc w:val="left"/>
+      <w:pPr>
+        <w:tabs>
+          <w:tab w:val="num" w:pos="1440"/>
+        </w:tabs>
+        <w:ind w:left="1440" w:hanging="360"/>
+      </w:pPr>
+      <w:rPr>
+        <w:rFonts w:ascii="Courier New" w:hAnsi="Courier New" w:hint="default"/>
+        <w:sz w:val="20"/>
+      </w:rPr>
+    </w:lvl>
+    <w:lvl w:ilvl="2" w:tentative="1">
+      <w:start w:val="1"/>
+      <w:numFmt w:val="bullet"/>
+      <w:lvlText w:val=""/>
+      <w:lvlJc w:val="left"/>
+      <w:pPr>
+        <w:tabs>
+          <w:tab w:val="num" w:pos="2160"/>
+        </w:tabs>
+        <w:ind w:left="2160" w:hanging="360"/>
+      </w:pPr>
+      <w:rPr>
+        <w:rFonts w:ascii="Wingdings" w:hAnsi="Wingdings" w:hint="default"/>
+        <w:sz w:val="20"/>
+      </w:rPr>
+    </w:lvl>
+    <w:lvl w:ilvl="3" w:tentative="1">
+      <w:start w:val="1"/>
+      <w:numFmt w:val="bullet"/>
+      <w:lvlText w:val=""/>
+      <w:lvlJc w:val="left"/>
+      <w:pPr>
+        <w:tabs>
+          <w:tab w:val="num" w:pos="2880"/>
+        </w:tabs>
+        <w:ind w:left="2880" w:hanging="360"/>
+      </w:pPr>
+      <w:rPr>
+        <w:rFonts w:ascii="Wingdings" w:hAnsi="Wingdings" w:hint="default"/>
+        <w:sz w:val="20"/>
+      </w:rPr>
+    </w:lvl>
+    <w:lvl w:ilvl="4" w:tentative="1">
+      <w:start w:val="1"/>
+      <w:numFmt w:val="bullet"/>
+      <w:lvlText w:val=""/>
+      <w:lvlJc w:val="left"/>
+      <w:pPr>
+        <w:tabs>
+          <w:tab w:val="num" w:pos="3600"/>
+        </w:tabs>
+        <w:ind w:left="3600" w:hanging="360"/>
+      </w:pPr>
+      <w:rPr>
+        <w:rFonts w:ascii="Wingdings" w:hAnsi="Wingdings" w:hint="default"/>
+        <w:sz w:val="20"/>
+      </w:rPr>
+    </w:lvl>
+    <w:lvl w:ilvl="5" w:tentative="1">
+      <w:start w:val="1"/>
+      <w:numFmt w:val="bullet"/>
+      <w:lvlText w:val=""/>
+      <w:lvlJc w:val="left"/>
+      <w:pPr>
+        <w:tabs>
+          <w:tab w:val="num" w:pos="4320"/>
+        </w:tabs>
+        <w:ind w:left="4320" w:hanging="360"/>
+      </w:pPr>
+      <w:rPr>
+        <w:rFonts w:ascii="Wingdings" w:hAnsi="Wingdings" w:hint="default"/>
+        <w:sz w:val="20"/>
+      </w:rPr>
+    </w:lvl>
+    <w:lvl w:ilvl="6" w:tentative="1">
+      <w:start w:val="1"/>
+      <w:numFmt w:val="bullet"/>
+      <w:lvlText w:val=""/>
+      <w:lvlJc w:val="left"/>
+      <w:pPr>
+        <w:tabs>
+          <w:tab w:val="num" w:pos="5040"/>
+        </w:tabs>
+        <w:ind w:left="5040" w:hanging="360"/>
+      </w:pPr>
+      <w:rPr>
+        <w:rFonts w:ascii="Wingdings" w:hAnsi="Wingdings" w:hint="default"/>
+        <w:sz w:val="20"/>
+      </w:rPr>
+    </w:lvl>
+    <w:lvl w:ilvl="7" w:tentative="1">
+      <w:start w:val="1"/>
+      <w:numFmt w:val="bullet"/>
+      <w:lvlText w:val=""/>
+      <w:lvlJc w:val="left"/>
+      <w:pPr>
+        <w:tabs>
+          <w:tab w:val="num" w:pos="5760"/>
+        </w:tabs>
+        <w:ind w:left="5760" w:hanging="360"/>
+      </w:pPr>
+      <w:rPr>
+        <w:rFonts w:ascii="Wingdings" w:hAnsi="Wingdings" w:hint="default"/>
+        <w:sz w:val="20"/>
+      </w:rPr>
+    </w:lvl>
+    <w:lvl w:ilvl="8" w:tentative="1">
+      <w:start w:val="1"/>
+      <w:numFmt w:val="bullet"/>
+      <w:lvlText w:val=""/>
+      <w:lvlJc w:val="left"/>
+      <w:pPr>
+        <w:tabs>
+          <w:tab w:val="num" w:pos="6480"/>
+        </w:tabs>
+        <w:ind w:left="6480" w:hanging="360"/>
+      </w:pPr>
+      <w:rPr>
+        <w:rFonts w:ascii="Wingdings" w:hAnsi="Wingdings" w:hint="default"/>
+        <w:sz w:val="20"/>
+      </w:rPr>
+    </w:lvl>
+  </w:abstractNum>
+  <w:abstractNum w:abstractNumId="3" w15:restartNumberingAfterBreak="0">
+    <w:nsid w:val="1D2A0F81"/>
+    <w:multiLevelType w:val="multilevel"/>
+    <w:tmpl w:val="DF30BF36"/>
+    <w:lvl w:ilvl="0">
+      <w:start w:val="1"/>
+      <w:numFmt w:val="bullet"/>
+      <w:lvlText w:val=""/>
+      <w:lvlJc w:val="left"/>
+      <w:pPr>
+        <w:tabs>
+          <w:tab w:val="num" w:pos="720"/>
+        </w:tabs>
+        <w:ind w:left="720" w:hanging="360"/>
+      </w:pPr>
+      <w:rPr>
+        <w:rFonts w:ascii="Symbol" w:hAnsi="Symbol" w:hint="default"/>
+        <w:sz w:val="20"/>
+      </w:rPr>
+    </w:lvl>
+    <w:lvl w:ilvl="1" w:tentative="1">
+      <w:start w:val="1"/>
+      <w:numFmt w:val="bullet"/>
+      <w:lvlText w:val="o"/>
+      <w:lvlJc w:val="left"/>
+      <w:pPr>
+        <w:tabs>
+          <w:tab w:val="num" w:pos="1440"/>
+        </w:tabs>
+        <w:ind w:left="1440" w:hanging="360"/>
+      </w:pPr>
+      <w:rPr>
+        <w:rFonts w:ascii="Courier New" w:hAnsi="Courier New" w:hint="default"/>
+        <w:sz w:val="20"/>
+      </w:rPr>
+    </w:lvl>
+    <w:lvl w:ilvl="2" w:tentative="1">
+      <w:start w:val="1"/>
+      <w:numFmt w:val="bullet"/>
+      <w:lvlText w:val=""/>
+      <w:lvlJc w:val="left"/>
+      <w:pPr>
+        <w:tabs>
+          <w:tab w:val="num" w:pos="2160"/>
+        </w:tabs>
+        <w:ind w:left="2160" w:hanging="360"/>
+      </w:pPr>
+      <w:rPr>
+        <w:rFonts w:ascii="Wingdings" w:hAnsi="Wingdings" w:hint="default"/>
+        <w:sz w:val="20"/>
+      </w:rPr>
+    </w:lvl>
+    <w:lvl w:ilvl="3" w:tentative="1">
+      <w:start w:val="1"/>
+      <w:numFmt w:val="bullet"/>
+      <w:lvlText w:val=""/>
+      <w:lvlJc w:val="left"/>
+      <w:pPr>
+        <w:tabs>
+          <w:tab w:val="num" w:pos="2880"/>
+        </w:tabs>
+        <w:ind w:left="2880" w:hanging="360"/>
+      </w:pPr>
+      <w:rPr>
+        <w:rFonts w:ascii="Wingdings" w:hAnsi="Wingdings" w:hint="default"/>
+        <w:sz w:val="20"/>
+      </w:rPr>
+    </w:lvl>
+    <w:lvl w:ilvl="4" w:tentative="1">
+      <w:start w:val="1"/>
+      <w:numFmt w:val="bullet"/>
+      <w:lvlText w:val=""/>
+      <w:lvlJc w:val="left"/>
+      <w:pPr>
+        <w:tabs>
+          <w:tab w:val="num" w:pos="3600"/>
+        </w:tabs>
+        <w:ind w:left="3600" w:hanging="360"/>
+      </w:pPr>
+      <w:rPr>
+        <w:rFonts w:ascii="Wingdings" w:hAnsi="Wingdings" w:hint="default"/>
+        <w:sz w:val="20"/>
+      </w:rPr>
+    </w:lvl>
+    <w:lvl w:ilvl="5" w:tentative="1">
+      <w:start w:val="1"/>
+      <w:numFmt w:val="bullet"/>
+      <w:lvlText w:val=""/>
+      <w:lvlJc w:val="left"/>
+      <w:pPr>
+        <w:tabs>
+          <w:tab w:val="num" w:pos="4320"/>
+        </w:tabs>
+        <w:ind w:left="4320" w:hanging="360"/>
+      </w:pPr>
+      <w:rPr>
+        <w:rFonts w:ascii="Wingdings" w:hAnsi="Wingdings" w:hint="default"/>
+        <w:sz w:val="20"/>
+      </w:rPr>
+    </w:lvl>
+    <w:lvl w:ilvl="6" w:tentative="1">
+      <w:start w:val="1"/>
+      <w:numFmt w:val="bullet"/>
+      <w:lvlText w:val=""/>
+      <w:lvlJc w:val="left"/>
+      <w:pPr>
+        <w:tabs>
+          <w:tab w:val="num" w:pos="5040"/>
+        </w:tabs>
+        <w:ind w:left="5040" w:hanging="360"/>
+      </w:pPr>
+      <w:rPr>
+        <w:rFonts w:ascii="Wingdings" w:hAnsi="Wingdings" w:hint="default"/>
+        <w:sz w:val="20"/>
+      </w:rPr>
+    </w:lvl>
+    <w:lvl w:ilvl="7" w:tentative="1">
+      <w:start w:val="1"/>
+      <w:numFmt w:val="bullet"/>
+      <w:lvlText w:val=""/>
+      <w:lvlJc w:val="left"/>
+      <w:pPr>
+        <w:tabs>
+          <w:tab w:val="num" w:pos="5760"/>
+        </w:tabs>
+        <w:ind w:left="5760" w:hanging="360"/>
+      </w:pPr>
+      <w:rPr>
+        <w:rFonts w:ascii="Wingdings" w:hAnsi="Wingdings" w:hint="default"/>
+        <w:sz w:val="20"/>
+      </w:rPr>
+    </w:lvl>
+    <w:lvl w:ilvl="8" w:tentative="1">
+      <w:start w:val="1"/>
+      <w:numFmt w:val="bullet"/>
+      <w:lvlText w:val=""/>
+      <w:lvlJc w:val="left"/>
+      <w:pPr>
+        <w:tabs>
+          <w:tab w:val="num" w:pos="6480"/>
+        </w:tabs>
+        <w:ind w:left="6480" w:hanging="360"/>
+      </w:pPr>
+      <w:rPr>
+        <w:rFonts w:ascii="Wingdings" w:hAnsi="Wingdings" w:hint="default"/>
+        <w:sz w:val="20"/>
+      </w:rPr>
+    </w:lvl>
+  </w:abstractNum>
+  <w:abstractNum w:abstractNumId="4" w15:restartNumberingAfterBreak="0">
+    <w:nsid w:val="1F7A3D66"/>
+    <w:multiLevelType w:val="multilevel"/>
+    <w:tmpl w:val="742E8958"/>
+    <w:lvl w:ilvl="0">
+      <w:start w:val="1"/>
+      <w:numFmt w:val="bullet"/>
+      <w:lvlText w:val=""/>
+      <w:lvlJc w:val="left"/>
+      <w:pPr>
+        <w:tabs>
+          <w:tab w:val="num" w:pos="720"/>
+        </w:tabs>
+        <w:ind w:left="720" w:hanging="360"/>
+      </w:pPr>
+      <w:rPr>
+        <w:rFonts w:ascii="Symbol" w:hAnsi="Symbol" w:hint="default"/>
+        <w:sz w:val="20"/>
+      </w:rPr>
+    </w:lvl>
+    <w:lvl w:ilvl="1" w:tentative="1">
+      <w:start w:val="1"/>
+      <w:numFmt w:val="bullet"/>
+      <w:lvlText w:val="o"/>
+      <w:lvlJc w:val="left"/>
+      <w:pPr>
+        <w:tabs>
+          <w:tab w:val="num" w:pos="1440"/>
+        </w:tabs>
+        <w:ind w:left="1440" w:hanging="360"/>
+      </w:pPr>
+      <w:rPr>
+        <w:rFonts w:ascii="Courier New" w:hAnsi="Courier New" w:hint="default"/>
+        <w:sz w:val="20"/>
+      </w:rPr>
+    </w:lvl>
+    <w:lvl w:ilvl="2" w:tentative="1">
+      <w:start w:val="1"/>
+      <w:numFmt w:val="bullet"/>
+      <w:lvlText w:val=""/>
+      <w:lvlJc w:val="left"/>
+      <w:pPr>
+        <w:tabs>
+          <w:tab w:val="num" w:pos="2160"/>
+        </w:tabs>
+        <w:ind w:left="2160" w:hanging="360"/>
+      </w:pPr>
+      <w:rPr>
+        <w:rFonts w:ascii="Wingdings" w:hAnsi="Wingdings" w:hint="default"/>
+        <w:sz w:val="20"/>
+      </w:rPr>
+    </w:lvl>
+    <w:lvl w:ilvl="3" w:tentative="1">
+      <w:start w:val="1"/>
+      <w:numFmt w:val="bullet"/>
+      <w:lvlText w:val=""/>
+      <w:lvlJc w:val="left"/>
+      <w:pPr>
+        <w:tabs>
+          <w:tab w:val="num" w:pos="2880"/>
+        </w:tabs>
+        <w:ind w:left="2880" w:hanging="360"/>
+      </w:pPr>
+      <w:rPr>
+        <w:rFonts w:ascii="Wingdings" w:hAnsi="Wingdings" w:hint="default"/>
+        <w:sz w:val="20"/>
+      </w:rPr>
+    </w:lvl>
+    <w:lvl w:ilvl="4" w:tentative="1">
+      <w:start w:val="1"/>
+      <w:numFmt w:val="bullet"/>
+      <w:lvlText w:val=""/>
+      <w:lvlJc w:val="left"/>
+      <w:pPr>
+        <w:tabs>
+          <w:tab w:val="num" w:pos="3600"/>
+        </w:tabs>
+        <w:ind w:left="3600" w:hanging="360"/>
+      </w:pPr>
+      <w:rPr>
+        <w:rFonts w:ascii="Wingdings" w:hAnsi="Wingdings" w:hint="default"/>
+        <w:sz w:val="20"/>
+      </w:rPr>
+    </w:lvl>
+    <w:lvl w:ilvl="5" w:tentative="1">
+      <w:start w:val="1"/>
+      <w:numFmt w:val="bullet"/>
+      <w:lvlText w:val=""/>
+      <w:lvlJc w:val="left"/>
+      <w:pPr>
+        <w:tabs>
+          <w:tab w:val="num" w:pos="4320"/>
+        </w:tabs>
+        <w:ind w:left="4320" w:hanging="360"/>
+      </w:pPr>
+      <w:rPr>
+        <w:rFonts w:ascii="Wingdings" w:hAnsi="Wingdings" w:hint="default"/>
+        <w:sz w:val="20"/>
+      </w:rPr>
+    </w:lvl>
+    <w:lvl w:ilvl="6" w:tentative="1">
+      <w:start w:val="1"/>
+      <w:numFmt w:val="bullet"/>
+      <w:lvlText w:val=""/>
+      <w:lvlJc w:val="left"/>
+      <w:pPr>
+        <w:tabs>
+          <w:tab w:val="num" w:pos="5040"/>
+        </w:tabs>
+        <w:ind w:left="5040" w:hanging="360"/>
+      </w:pPr>
+      <w:rPr>
+        <w:rFonts w:ascii="Wingdings" w:hAnsi="Wingdings" w:hint="default"/>
+        <w:sz w:val="20"/>
+      </w:rPr>
+    </w:lvl>
+    <w:lvl w:ilvl="7" w:tentative="1">
+      <w:start w:val="1"/>
+      <w:numFmt w:val="bullet"/>
+      <w:lvlText w:val=""/>
+      <w:lvlJc w:val="left"/>
+      <w:pPr>
+        <w:tabs>
+          <w:tab w:val="num" w:pos="5760"/>
+        </w:tabs>
+        <w:ind w:left="5760" w:hanging="360"/>
+      </w:pPr>
+      <w:rPr>
+        <w:rFonts w:ascii="Wingdings" w:hAnsi="Wingdings" w:hint="default"/>
+        <w:sz w:val="20"/>
+      </w:rPr>
+    </w:lvl>
+    <w:lvl w:ilvl="8" w:tentative="1">
+      <w:start w:val="1"/>
+      <w:numFmt w:val="bullet"/>
+      <w:lvlText w:val=""/>
+      <w:lvlJc w:val="left"/>
+      <w:pPr>
+        <w:tabs>
+          <w:tab w:val="num" w:pos="6480"/>
+        </w:tabs>
+        <w:ind w:left="6480" w:hanging="360"/>
+      </w:pPr>
+      <w:rPr>
+        <w:rFonts w:ascii="Wingdings" w:hAnsi="Wingdings" w:hint="default"/>
+        <w:sz w:val="20"/>
+      </w:rPr>
+    </w:lvl>
+  </w:abstractNum>
+  <w:abstractNum w:abstractNumId="5" w15:restartNumberingAfterBreak="0">
     <w:nsid w:val="219F7A85"/>
     <w:multiLevelType w:val="hybridMultilevel"/>
     <w:tmpl w:val="CDE2E554"/>
@@ -455,8 +1976,1391 @@
       </w:rPr>
     </w:lvl>
   </w:abstractNum>
+  <w:abstractNum w:abstractNumId="6" w15:restartNumberingAfterBreak="0">
+    <w:nsid w:val="250E3168"/>
+    <w:multiLevelType w:val="multilevel"/>
+    <w:tmpl w:val="4EAEE3E4"/>
+    <w:lvl w:ilvl="0">
+      <w:start w:val="1"/>
+      <w:numFmt w:val="bullet"/>
+      <w:lvlText w:val=""/>
+      <w:lvlJc w:val="left"/>
+      <w:pPr>
+        <w:tabs>
+          <w:tab w:val="num" w:pos="720"/>
+        </w:tabs>
+        <w:ind w:left="720" w:hanging="360"/>
+      </w:pPr>
+      <w:rPr>
+        <w:rFonts w:ascii="Symbol" w:hAnsi="Symbol" w:hint="default"/>
+        <w:sz w:val="20"/>
+      </w:rPr>
+    </w:lvl>
+    <w:lvl w:ilvl="1">
+      <w:start w:val="1"/>
+      <w:numFmt w:val="bullet"/>
+      <w:lvlText w:val="o"/>
+      <w:lvlJc w:val="left"/>
+      <w:pPr>
+        <w:tabs>
+          <w:tab w:val="num" w:pos="1440"/>
+        </w:tabs>
+        <w:ind w:left="1440" w:hanging="360"/>
+      </w:pPr>
+      <w:rPr>
+        <w:rFonts w:ascii="Courier New" w:hAnsi="Courier New" w:hint="default"/>
+        <w:sz w:val="20"/>
+      </w:rPr>
+    </w:lvl>
+    <w:lvl w:ilvl="2" w:tentative="1">
+      <w:start w:val="1"/>
+      <w:numFmt w:val="bullet"/>
+      <w:lvlText w:val=""/>
+      <w:lvlJc w:val="left"/>
+      <w:pPr>
+        <w:tabs>
+          <w:tab w:val="num" w:pos="2160"/>
+        </w:tabs>
+        <w:ind w:left="2160" w:hanging="360"/>
+      </w:pPr>
+      <w:rPr>
+        <w:rFonts w:ascii="Wingdings" w:hAnsi="Wingdings" w:hint="default"/>
+        <w:sz w:val="20"/>
+      </w:rPr>
+    </w:lvl>
+    <w:lvl w:ilvl="3" w:tentative="1">
+      <w:start w:val="1"/>
+      <w:numFmt w:val="bullet"/>
+      <w:lvlText w:val=""/>
+      <w:lvlJc w:val="left"/>
+      <w:pPr>
+        <w:tabs>
+          <w:tab w:val="num" w:pos="2880"/>
+        </w:tabs>
+        <w:ind w:left="2880" w:hanging="360"/>
+      </w:pPr>
+      <w:rPr>
+        <w:rFonts w:ascii="Wingdings" w:hAnsi="Wingdings" w:hint="default"/>
+        <w:sz w:val="20"/>
+      </w:rPr>
+    </w:lvl>
+    <w:lvl w:ilvl="4" w:tentative="1">
+      <w:start w:val="1"/>
+      <w:numFmt w:val="bullet"/>
+      <w:lvlText w:val=""/>
+      <w:lvlJc w:val="left"/>
+      <w:pPr>
+        <w:tabs>
+          <w:tab w:val="num" w:pos="3600"/>
+        </w:tabs>
+        <w:ind w:left="3600" w:hanging="360"/>
+      </w:pPr>
+      <w:rPr>
+        <w:rFonts w:ascii="Wingdings" w:hAnsi="Wingdings" w:hint="default"/>
+        <w:sz w:val="20"/>
+      </w:rPr>
+    </w:lvl>
+    <w:lvl w:ilvl="5" w:tentative="1">
+      <w:start w:val="1"/>
+      <w:numFmt w:val="bullet"/>
+      <w:lvlText w:val=""/>
+      <w:lvlJc w:val="left"/>
+      <w:pPr>
+        <w:tabs>
+          <w:tab w:val="num" w:pos="4320"/>
+        </w:tabs>
+        <w:ind w:left="4320" w:hanging="360"/>
+      </w:pPr>
+      <w:rPr>
+        <w:rFonts w:ascii="Wingdings" w:hAnsi="Wingdings" w:hint="default"/>
+        <w:sz w:val="20"/>
+      </w:rPr>
+    </w:lvl>
+    <w:lvl w:ilvl="6" w:tentative="1">
+      <w:start w:val="1"/>
+      <w:numFmt w:val="bullet"/>
+      <w:lvlText w:val=""/>
+      <w:lvlJc w:val="left"/>
+      <w:pPr>
+        <w:tabs>
+          <w:tab w:val="num" w:pos="5040"/>
+        </w:tabs>
+        <w:ind w:left="5040" w:hanging="360"/>
+      </w:pPr>
+      <w:rPr>
+        <w:rFonts w:ascii="Wingdings" w:hAnsi="Wingdings" w:hint="default"/>
+        <w:sz w:val="20"/>
+      </w:rPr>
+    </w:lvl>
+    <w:lvl w:ilvl="7" w:tentative="1">
+      <w:start w:val="1"/>
+      <w:numFmt w:val="bullet"/>
+      <w:lvlText w:val=""/>
+      <w:lvlJc w:val="left"/>
+      <w:pPr>
+        <w:tabs>
+          <w:tab w:val="num" w:pos="5760"/>
+        </w:tabs>
+        <w:ind w:left="5760" w:hanging="360"/>
+      </w:pPr>
+      <w:rPr>
+        <w:rFonts w:ascii="Wingdings" w:hAnsi="Wingdings" w:hint="default"/>
+        <w:sz w:val="20"/>
+      </w:rPr>
+    </w:lvl>
+    <w:lvl w:ilvl="8" w:tentative="1">
+      <w:start w:val="1"/>
+      <w:numFmt w:val="bullet"/>
+      <w:lvlText w:val=""/>
+      <w:lvlJc w:val="left"/>
+      <w:pPr>
+        <w:tabs>
+          <w:tab w:val="num" w:pos="6480"/>
+        </w:tabs>
+        <w:ind w:left="6480" w:hanging="360"/>
+      </w:pPr>
+      <w:rPr>
+        <w:rFonts w:ascii="Wingdings" w:hAnsi="Wingdings" w:hint="default"/>
+        <w:sz w:val="20"/>
+      </w:rPr>
+    </w:lvl>
+  </w:abstractNum>
+  <w:abstractNum w:abstractNumId="7" w15:restartNumberingAfterBreak="0">
+    <w:nsid w:val="2B2615E2"/>
+    <w:multiLevelType w:val="multilevel"/>
+    <w:tmpl w:val="6CE06B8C"/>
+    <w:lvl w:ilvl="0">
+      <w:start w:val="1"/>
+      <w:numFmt w:val="bullet"/>
+      <w:lvlText w:val=""/>
+      <w:lvlJc w:val="left"/>
+      <w:pPr>
+        <w:tabs>
+          <w:tab w:val="num" w:pos="720"/>
+        </w:tabs>
+        <w:ind w:left="720" w:hanging="360"/>
+      </w:pPr>
+      <w:rPr>
+        <w:rFonts w:ascii="Symbol" w:hAnsi="Symbol" w:hint="default"/>
+        <w:sz w:val="20"/>
+      </w:rPr>
+    </w:lvl>
+    <w:lvl w:ilvl="1" w:tentative="1">
+      <w:start w:val="1"/>
+      <w:numFmt w:val="bullet"/>
+      <w:lvlText w:val="o"/>
+      <w:lvlJc w:val="left"/>
+      <w:pPr>
+        <w:tabs>
+          <w:tab w:val="num" w:pos="1440"/>
+        </w:tabs>
+        <w:ind w:left="1440" w:hanging="360"/>
+      </w:pPr>
+      <w:rPr>
+        <w:rFonts w:ascii="Courier New" w:hAnsi="Courier New" w:hint="default"/>
+        <w:sz w:val="20"/>
+      </w:rPr>
+    </w:lvl>
+    <w:lvl w:ilvl="2" w:tentative="1">
+      <w:start w:val="1"/>
+      <w:numFmt w:val="bullet"/>
+      <w:lvlText w:val=""/>
+      <w:lvlJc w:val="left"/>
+      <w:pPr>
+        <w:tabs>
+          <w:tab w:val="num" w:pos="2160"/>
+        </w:tabs>
+        <w:ind w:left="2160" w:hanging="360"/>
+      </w:pPr>
+      <w:rPr>
+        <w:rFonts w:ascii="Wingdings" w:hAnsi="Wingdings" w:hint="default"/>
+        <w:sz w:val="20"/>
+      </w:rPr>
+    </w:lvl>
+    <w:lvl w:ilvl="3" w:tentative="1">
+      <w:start w:val="1"/>
+      <w:numFmt w:val="bullet"/>
+      <w:lvlText w:val=""/>
+      <w:lvlJc w:val="left"/>
+      <w:pPr>
+        <w:tabs>
+          <w:tab w:val="num" w:pos="2880"/>
+        </w:tabs>
+        <w:ind w:left="2880" w:hanging="360"/>
+      </w:pPr>
+      <w:rPr>
+        <w:rFonts w:ascii="Wingdings" w:hAnsi="Wingdings" w:hint="default"/>
+        <w:sz w:val="20"/>
+      </w:rPr>
+    </w:lvl>
+    <w:lvl w:ilvl="4" w:tentative="1">
+      <w:start w:val="1"/>
+      <w:numFmt w:val="bullet"/>
+      <w:lvlText w:val=""/>
+      <w:lvlJc w:val="left"/>
+      <w:pPr>
+        <w:tabs>
+          <w:tab w:val="num" w:pos="3600"/>
+        </w:tabs>
+        <w:ind w:left="3600" w:hanging="360"/>
+      </w:pPr>
+      <w:rPr>
+        <w:rFonts w:ascii="Wingdings" w:hAnsi="Wingdings" w:hint="default"/>
+        <w:sz w:val="20"/>
+      </w:rPr>
+    </w:lvl>
+    <w:lvl w:ilvl="5" w:tentative="1">
+      <w:start w:val="1"/>
+      <w:numFmt w:val="bullet"/>
+      <w:lvlText w:val=""/>
+      <w:lvlJc w:val="left"/>
+      <w:pPr>
+        <w:tabs>
+          <w:tab w:val="num" w:pos="4320"/>
+        </w:tabs>
+        <w:ind w:left="4320" w:hanging="360"/>
+      </w:pPr>
+      <w:rPr>
+        <w:rFonts w:ascii="Wingdings" w:hAnsi="Wingdings" w:hint="default"/>
+        <w:sz w:val="20"/>
+      </w:rPr>
+    </w:lvl>
+    <w:lvl w:ilvl="6" w:tentative="1">
+      <w:start w:val="1"/>
+      <w:numFmt w:val="bullet"/>
+      <w:lvlText w:val=""/>
+      <w:lvlJc w:val="left"/>
+      <w:pPr>
+        <w:tabs>
+          <w:tab w:val="num" w:pos="5040"/>
+        </w:tabs>
+        <w:ind w:left="5040" w:hanging="360"/>
+      </w:pPr>
+      <w:rPr>
+        <w:rFonts w:ascii="Wingdings" w:hAnsi="Wingdings" w:hint="default"/>
+        <w:sz w:val="20"/>
+      </w:rPr>
+    </w:lvl>
+    <w:lvl w:ilvl="7" w:tentative="1">
+      <w:start w:val="1"/>
+      <w:numFmt w:val="bullet"/>
+      <w:lvlText w:val=""/>
+      <w:lvlJc w:val="left"/>
+      <w:pPr>
+        <w:tabs>
+          <w:tab w:val="num" w:pos="5760"/>
+        </w:tabs>
+        <w:ind w:left="5760" w:hanging="360"/>
+      </w:pPr>
+      <w:rPr>
+        <w:rFonts w:ascii="Wingdings" w:hAnsi="Wingdings" w:hint="default"/>
+        <w:sz w:val="20"/>
+      </w:rPr>
+    </w:lvl>
+    <w:lvl w:ilvl="8" w:tentative="1">
+      <w:start w:val="1"/>
+      <w:numFmt w:val="bullet"/>
+      <w:lvlText w:val=""/>
+      <w:lvlJc w:val="left"/>
+      <w:pPr>
+        <w:tabs>
+          <w:tab w:val="num" w:pos="6480"/>
+        </w:tabs>
+        <w:ind w:left="6480" w:hanging="360"/>
+      </w:pPr>
+      <w:rPr>
+        <w:rFonts w:ascii="Wingdings" w:hAnsi="Wingdings" w:hint="default"/>
+        <w:sz w:val="20"/>
+      </w:rPr>
+    </w:lvl>
+  </w:abstractNum>
+  <w:abstractNum w:abstractNumId="8" w15:restartNumberingAfterBreak="0">
+    <w:nsid w:val="31652545"/>
+    <w:multiLevelType w:val="multilevel"/>
+    <w:tmpl w:val="E21CE248"/>
+    <w:lvl w:ilvl="0">
+      <w:start w:val="1"/>
+      <w:numFmt w:val="bullet"/>
+      <w:lvlText w:val=""/>
+      <w:lvlJc w:val="left"/>
+      <w:pPr>
+        <w:tabs>
+          <w:tab w:val="num" w:pos="720"/>
+        </w:tabs>
+        <w:ind w:left="720" w:hanging="360"/>
+      </w:pPr>
+      <w:rPr>
+        <w:rFonts w:ascii="Symbol" w:hAnsi="Symbol" w:hint="default"/>
+        <w:sz w:val="20"/>
+      </w:rPr>
+    </w:lvl>
+    <w:lvl w:ilvl="1" w:tentative="1">
+      <w:start w:val="1"/>
+      <w:numFmt w:val="bullet"/>
+      <w:lvlText w:val="o"/>
+      <w:lvlJc w:val="left"/>
+      <w:pPr>
+        <w:tabs>
+          <w:tab w:val="num" w:pos="1440"/>
+        </w:tabs>
+        <w:ind w:left="1440" w:hanging="360"/>
+      </w:pPr>
+      <w:rPr>
+        <w:rFonts w:ascii="Courier New" w:hAnsi="Courier New" w:hint="default"/>
+        <w:sz w:val="20"/>
+      </w:rPr>
+    </w:lvl>
+    <w:lvl w:ilvl="2" w:tentative="1">
+      <w:start w:val="1"/>
+      <w:numFmt w:val="bullet"/>
+      <w:lvlText w:val=""/>
+      <w:lvlJc w:val="left"/>
+      <w:pPr>
+        <w:tabs>
+          <w:tab w:val="num" w:pos="2160"/>
+        </w:tabs>
+        <w:ind w:left="2160" w:hanging="360"/>
+      </w:pPr>
+      <w:rPr>
+        <w:rFonts w:ascii="Wingdings" w:hAnsi="Wingdings" w:hint="default"/>
+        <w:sz w:val="20"/>
+      </w:rPr>
+    </w:lvl>
+    <w:lvl w:ilvl="3" w:tentative="1">
+      <w:start w:val="1"/>
+      <w:numFmt w:val="bullet"/>
+      <w:lvlText w:val=""/>
+      <w:lvlJc w:val="left"/>
+      <w:pPr>
+        <w:tabs>
+          <w:tab w:val="num" w:pos="2880"/>
+        </w:tabs>
+        <w:ind w:left="2880" w:hanging="360"/>
+      </w:pPr>
+      <w:rPr>
+        <w:rFonts w:ascii="Wingdings" w:hAnsi="Wingdings" w:hint="default"/>
+        <w:sz w:val="20"/>
+      </w:rPr>
+    </w:lvl>
+    <w:lvl w:ilvl="4" w:tentative="1">
+      <w:start w:val="1"/>
+      <w:numFmt w:val="bullet"/>
+      <w:lvlText w:val=""/>
+      <w:lvlJc w:val="left"/>
+      <w:pPr>
+        <w:tabs>
+          <w:tab w:val="num" w:pos="3600"/>
+        </w:tabs>
+        <w:ind w:left="3600" w:hanging="360"/>
+      </w:pPr>
+      <w:rPr>
+        <w:rFonts w:ascii="Wingdings" w:hAnsi="Wingdings" w:hint="default"/>
+        <w:sz w:val="20"/>
+      </w:rPr>
+    </w:lvl>
+    <w:lvl w:ilvl="5" w:tentative="1">
+      <w:start w:val="1"/>
+      <w:numFmt w:val="bullet"/>
+      <w:lvlText w:val=""/>
+      <w:lvlJc w:val="left"/>
+      <w:pPr>
+        <w:tabs>
+          <w:tab w:val="num" w:pos="4320"/>
+        </w:tabs>
+        <w:ind w:left="4320" w:hanging="360"/>
+      </w:pPr>
+      <w:rPr>
+        <w:rFonts w:ascii="Wingdings" w:hAnsi="Wingdings" w:hint="default"/>
+        <w:sz w:val="20"/>
+      </w:rPr>
+    </w:lvl>
+    <w:lvl w:ilvl="6" w:tentative="1">
+      <w:start w:val="1"/>
+      <w:numFmt w:val="bullet"/>
+      <w:lvlText w:val=""/>
+      <w:lvlJc w:val="left"/>
+      <w:pPr>
+        <w:tabs>
+          <w:tab w:val="num" w:pos="5040"/>
+        </w:tabs>
+        <w:ind w:left="5040" w:hanging="360"/>
+      </w:pPr>
+      <w:rPr>
+        <w:rFonts w:ascii="Wingdings" w:hAnsi="Wingdings" w:hint="default"/>
+        <w:sz w:val="20"/>
+      </w:rPr>
+    </w:lvl>
+    <w:lvl w:ilvl="7" w:tentative="1">
+      <w:start w:val="1"/>
+      <w:numFmt w:val="bullet"/>
+      <w:lvlText w:val=""/>
+      <w:lvlJc w:val="left"/>
+      <w:pPr>
+        <w:tabs>
+          <w:tab w:val="num" w:pos="5760"/>
+        </w:tabs>
+        <w:ind w:left="5760" w:hanging="360"/>
+      </w:pPr>
+      <w:rPr>
+        <w:rFonts w:ascii="Wingdings" w:hAnsi="Wingdings" w:hint="default"/>
+        <w:sz w:val="20"/>
+      </w:rPr>
+    </w:lvl>
+    <w:lvl w:ilvl="8" w:tentative="1">
+      <w:start w:val="1"/>
+      <w:numFmt w:val="bullet"/>
+      <w:lvlText w:val=""/>
+      <w:lvlJc w:val="left"/>
+      <w:pPr>
+        <w:tabs>
+          <w:tab w:val="num" w:pos="6480"/>
+        </w:tabs>
+        <w:ind w:left="6480" w:hanging="360"/>
+      </w:pPr>
+      <w:rPr>
+        <w:rFonts w:ascii="Wingdings" w:hAnsi="Wingdings" w:hint="default"/>
+        <w:sz w:val="20"/>
+      </w:rPr>
+    </w:lvl>
+  </w:abstractNum>
+  <w:abstractNum w:abstractNumId="9" w15:restartNumberingAfterBreak="0">
+    <w:nsid w:val="57134E07"/>
+    <w:multiLevelType w:val="multilevel"/>
+    <w:tmpl w:val="64744A18"/>
+    <w:lvl w:ilvl="0">
+      <w:start w:val="1"/>
+      <w:numFmt w:val="bullet"/>
+      <w:lvlText w:val=""/>
+      <w:lvlJc w:val="left"/>
+      <w:pPr>
+        <w:tabs>
+          <w:tab w:val="num" w:pos="720"/>
+        </w:tabs>
+        <w:ind w:left="720" w:hanging="360"/>
+      </w:pPr>
+      <w:rPr>
+        <w:rFonts w:ascii="Symbol" w:hAnsi="Symbol" w:hint="default"/>
+        <w:sz w:val="20"/>
+      </w:rPr>
+    </w:lvl>
+    <w:lvl w:ilvl="1">
+      <w:start w:val="1"/>
+      <w:numFmt w:val="bullet"/>
+      <w:lvlText w:val="o"/>
+      <w:lvlJc w:val="left"/>
+      <w:pPr>
+        <w:tabs>
+          <w:tab w:val="num" w:pos="1440"/>
+        </w:tabs>
+        <w:ind w:left="1440" w:hanging="360"/>
+      </w:pPr>
+      <w:rPr>
+        <w:rFonts w:ascii="Courier New" w:hAnsi="Courier New" w:hint="default"/>
+        <w:sz w:val="20"/>
+      </w:rPr>
+    </w:lvl>
+    <w:lvl w:ilvl="2" w:tentative="1">
+      <w:start w:val="1"/>
+      <w:numFmt w:val="bullet"/>
+      <w:lvlText w:val=""/>
+      <w:lvlJc w:val="left"/>
+      <w:pPr>
+        <w:tabs>
+          <w:tab w:val="num" w:pos="2160"/>
+        </w:tabs>
+        <w:ind w:left="2160" w:hanging="360"/>
+      </w:pPr>
+      <w:rPr>
+        <w:rFonts w:ascii="Wingdings" w:hAnsi="Wingdings" w:hint="default"/>
+        <w:sz w:val="20"/>
+      </w:rPr>
+    </w:lvl>
+    <w:lvl w:ilvl="3" w:tentative="1">
+      <w:start w:val="1"/>
+      <w:numFmt w:val="bullet"/>
+      <w:lvlText w:val=""/>
+      <w:lvlJc w:val="left"/>
+      <w:pPr>
+        <w:tabs>
+          <w:tab w:val="num" w:pos="2880"/>
+        </w:tabs>
+        <w:ind w:left="2880" w:hanging="360"/>
+      </w:pPr>
+      <w:rPr>
+        <w:rFonts w:ascii="Wingdings" w:hAnsi="Wingdings" w:hint="default"/>
+        <w:sz w:val="20"/>
+      </w:rPr>
+    </w:lvl>
+    <w:lvl w:ilvl="4" w:tentative="1">
+      <w:start w:val="1"/>
+      <w:numFmt w:val="bullet"/>
+      <w:lvlText w:val=""/>
+      <w:lvlJc w:val="left"/>
+      <w:pPr>
+        <w:tabs>
+          <w:tab w:val="num" w:pos="3600"/>
+        </w:tabs>
+        <w:ind w:left="3600" w:hanging="360"/>
+      </w:pPr>
+      <w:rPr>
+        <w:rFonts w:ascii="Wingdings" w:hAnsi="Wingdings" w:hint="default"/>
+        <w:sz w:val="20"/>
+      </w:rPr>
+    </w:lvl>
+    <w:lvl w:ilvl="5" w:tentative="1">
+      <w:start w:val="1"/>
+      <w:numFmt w:val="bullet"/>
+      <w:lvlText w:val=""/>
+      <w:lvlJc w:val="left"/>
+      <w:pPr>
+        <w:tabs>
+          <w:tab w:val="num" w:pos="4320"/>
+        </w:tabs>
+        <w:ind w:left="4320" w:hanging="360"/>
+      </w:pPr>
+      <w:rPr>
+        <w:rFonts w:ascii="Wingdings" w:hAnsi="Wingdings" w:hint="default"/>
+        <w:sz w:val="20"/>
+      </w:rPr>
+    </w:lvl>
+    <w:lvl w:ilvl="6" w:tentative="1">
+      <w:start w:val="1"/>
+      <w:numFmt w:val="bullet"/>
+      <w:lvlText w:val=""/>
+      <w:lvlJc w:val="left"/>
+      <w:pPr>
+        <w:tabs>
+          <w:tab w:val="num" w:pos="5040"/>
+        </w:tabs>
+        <w:ind w:left="5040" w:hanging="360"/>
+      </w:pPr>
+      <w:rPr>
+        <w:rFonts w:ascii="Wingdings" w:hAnsi="Wingdings" w:hint="default"/>
+        <w:sz w:val="20"/>
+      </w:rPr>
+    </w:lvl>
+    <w:lvl w:ilvl="7" w:tentative="1">
+      <w:start w:val="1"/>
+      <w:numFmt w:val="bullet"/>
+      <w:lvlText w:val=""/>
+      <w:lvlJc w:val="left"/>
+      <w:pPr>
+        <w:tabs>
+          <w:tab w:val="num" w:pos="5760"/>
+        </w:tabs>
+        <w:ind w:left="5760" w:hanging="360"/>
+      </w:pPr>
+      <w:rPr>
+        <w:rFonts w:ascii="Wingdings" w:hAnsi="Wingdings" w:hint="default"/>
+        <w:sz w:val="20"/>
+      </w:rPr>
+    </w:lvl>
+    <w:lvl w:ilvl="8" w:tentative="1">
+      <w:start w:val="1"/>
+      <w:numFmt w:val="bullet"/>
+      <w:lvlText w:val=""/>
+      <w:lvlJc w:val="left"/>
+      <w:pPr>
+        <w:tabs>
+          <w:tab w:val="num" w:pos="6480"/>
+        </w:tabs>
+        <w:ind w:left="6480" w:hanging="360"/>
+      </w:pPr>
+      <w:rPr>
+        <w:rFonts w:ascii="Wingdings" w:hAnsi="Wingdings" w:hint="default"/>
+        <w:sz w:val="20"/>
+      </w:rPr>
+    </w:lvl>
+  </w:abstractNum>
+  <w:abstractNum w:abstractNumId="10" w15:restartNumberingAfterBreak="0">
+    <w:nsid w:val="66AD3744"/>
+    <w:multiLevelType w:val="multilevel"/>
+    <w:tmpl w:val="EE5E172A"/>
+    <w:lvl w:ilvl="0">
+      <w:start w:val="1"/>
+      <w:numFmt w:val="bullet"/>
+      <w:lvlText w:val=""/>
+      <w:lvlJc w:val="left"/>
+      <w:pPr>
+        <w:tabs>
+          <w:tab w:val="num" w:pos="720"/>
+        </w:tabs>
+        <w:ind w:left="720" w:hanging="360"/>
+      </w:pPr>
+      <w:rPr>
+        <w:rFonts w:ascii="Symbol" w:hAnsi="Symbol" w:hint="default"/>
+        <w:sz w:val="20"/>
+      </w:rPr>
+    </w:lvl>
+    <w:lvl w:ilvl="1" w:tentative="1">
+      <w:start w:val="1"/>
+      <w:numFmt w:val="bullet"/>
+      <w:lvlText w:val="o"/>
+      <w:lvlJc w:val="left"/>
+      <w:pPr>
+        <w:tabs>
+          <w:tab w:val="num" w:pos="1440"/>
+        </w:tabs>
+        <w:ind w:left="1440" w:hanging="360"/>
+      </w:pPr>
+      <w:rPr>
+        <w:rFonts w:ascii="Courier New" w:hAnsi="Courier New" w:hint="default"/>
+        <w:sz w:val="20"/>
+      </w:rPr>
+    </w:lvl>
+    <w:lvl w:ilvl="2" w:tentative="1">
+      <w:start w:val="1"/>
+      <w:numFmt w:val="bullet"/>
+      <w:lvlText w:val=""/>
+      <w:lvlJc w:val="left"/>
+      <w:pPr>
+        <w:tabs>
+          <w:tab w:val="num" w:pos="2160"/>
+        </w:tabs>
+        <w:ind w:left="2160" w:hanging="360"/>
+      </w:pPr>
+      <w:rPr>
+        <w:rFonts w:ascii="Wingdings" w:hAnsi="Wingdings" w:hint="default"/>
+        <w:sz w:val="20"/>
+      </w:rPr>
+    </w:lvl>
+    <w:lvl w:ilvl="3" w:tentative="1">
+      <w:start w:val="1"/>
+      <w:numFmt w:val="bullet"/>
+      <w:lvlText w:val=""/>
+      <w:lvlJc w:val="left"/>
+      <w:pPr>
+        <w:tabs>
+          <w:tab w:val="num" w:pos="2880"/>
+        </w:tabs>
+        <w:ind w:left="2880" w:hanging="360"/>
+      </w:pPr>
+      <w:rPr>
+        <w:rFonts w:ascii="Wingdings" w:hAnsi="Wingdings" w:hint="default"/>
+        <w:sz w:val="20"/>
+      </w:rPr>
+    </w:lvl>
+    <w:lvl w:ilvl="4" w:tentative="1">
+      <w:start w:val="1"/>
+      <w:numFmt w:val="bullet"/>
+      <w:lvlText w:val=""/>
+      <w:lvlJc w:val="left"/>
+      <w:pPr>
+        <w:tabs>
+          <w:tab w:val="num" w:pos="3600"/>
+        </w:tabs>
+        <w:ind w:left="3600" w:hanging="360"/>
+      </w:pPr>
+      <w:rPr>
+        <w:rFonts w:ascii="Wingdings" w:hAnsi="Wingdings" w:hint="default"/>
+        <w:sz w:val="20"/>
+      </w:rPr>
+    </w:lvl>
+    <w:lvl w:ilvl="5" w:tentative="1">
+      <w:start w:val="1"/>
+      <w:numFmt w:val="bullet"/>
+      <w:lvlText w:val=""/>
+      <w:lvlJc w:val="left"/>
+      <w:pPr>
+        <w:tabs>
+          <w:tab w:val="num" w:pos="4320"/>
+        </w:tabs>
+        <w:ind w:left="4320" w:hanging="360"/>
+      </w:pPr>
+      <w:rPr>
+        <w:rFonts w:ascii="Wingdings" w:hAnsi="Wingdings" w:hint="default"/>
+        <w:sz w:val="20"/>
+      </w:rPr>
+    </w:lvl>
+    <w:lvl w:ilvl="6" w:tentative="1">
+      <w:start w:val="1"/>
+      <w:numFmt w:val="bullet"/>
+      <w:lvlText w:val=""/>
+      <w:lvlJc w:val="left"/>
+      <w:pPr>
+        <w:tabs>
+          <w:tab w:val="num" w:pos="5040"/>
+        </w:tabs>
+        <w:ind w:left="5040" w:hanging="360"/>
+      </w:pPr>
+      <w:rPr>
+        <w:rFonts w:ascii="Wingdings" w:hAnsi="Wingdings" w:hint="default"/>
+        <w:sz w:val="20"/>
+      </w:rPr>
+    </w:lvl>
+    <w:lvl w:ilvl="7" w:tentative="1">
+      <w:start w:val="1"/>
+      <w:numFmt w:val="bullet"/>
+      <w:lvlText w:val=""/>
+      <w:lvlJc w:val="left"/>
+      <w:pPr>
+        <w:tabs>
+          <w:tab w:val="num" w:pos="5760"/>
+        </w:tabs>
+        <w:ind w:left="5760" w:hanging="360"/>
+      </w:pPr>
+      <w:rPr>
+        <w:rFonts w:ascii="Wingdings" w:hAnsi="Wingdings" w:hint="default"/>
+        <w:sz w:val="20"/>
+      </w:rPr>
+    </w:lvl>
+    <w:lvl w:ilvl="8" w:tentative="1">
+      <w:start w:val="1"/>
+      <w:numFmt w:val="bullet"/>
+      <w:lvlText w:val=""/>
+      <w:lvlJc w:val="left"/>
+      <w:pPr>
+        <w:tabs>
+          <w:tab w:val="num" w:pos="6480"/>
+        </w:tabs>
+        <w:ind w:left="6480" w:hanging="360"/>
+      </w:pPr>
+      <w:rPr>
+        <w:rFonts w:ascii="Wingdings" w:hAnsi="Wingdings" w:hint="default"/>
+        <w:sz w:val="20"/>
+      </w:rPr>
+    </w:lvl>
+  </w:abstractNum>
+  <w:abstractNum w:abstractNumId="11" w15:restartNumberingAfterBreak="0">
+    <w:nsid w:val="6A7F5D7F"/>
+    <w:multiLevelType w:val="multilevel"/>
+    <w:tmpl w:val="2410F7D8"/>
+    <w:lvl w:ilvl="0">
+      <w:start w:val="1"/>
+      <w:numFmt w:val="bullet"/>
+      <w:lvlText w:val=""/>
+      <w:lvlJc w:val="left"/>
+      <w:pPr>
+        <w:tabs>
+          <w:tab w:val="num" w:pos="720"/>
+        </w:tabs>
+        <w:ind w:left="720" w:hanging="360"/>
+      </w:pPr>
+      <w:rPr>
+        <w:rFonts w:ascii="Symbol" w:hAnsi="Symbol" w:hint="default"/>
+        <w:sz w:val="20"/>
+      </w:rPr>
+    </w:lvl>
+    <w:lvl w:ilvl="1" w:tentative="1">
+      <w:start w:val="1"/>
+      <w:numFmt w:val="bullet"/>
+      <w:lvlText w:val="o"/>
+      <w:lvlJc w:val="left"/>
+      <w:pPr>
+        <w:tabs>
+          <w:tab w:val="num" w:pos="1440"/>
+        </w:tabs>
+        <w:ind w:left="1440" w:hanging="360"/>
+      </w:pPr>
+      <w:rPr>
+        <w:rFonts w:ascii="Courier New" w:hAnsi="Courier New" w:hint="default"/>
+        <w:sz w:val="20"/>
+      </w:rPr>
+    </w:lvl>
+    <w:lvl w:ilvl="2" w:tentative="1">
+      <w:start w:val="1"/>
+      <w:numFmt w:val="bullet"/>
+      <w:lvlText w:val=""/>
+      <w:lvlJc w:val="left"/>
+      <w:pPr>
+        <w:tabs>
+          <w:tab w:val="num" w:pos="2160"/>
+        </w:tabs>
+        <w:ind w:left="2160" w:hanging="360"/>
+      </w:pPr>
+      <w:rPr>
+        <w:rFonts w:ascii="Wingdings" w:hAnsi="Wingdings" w:hint="default"/>
+        <w:sz w:val="20"/>
+      </w:rPr>
+    </w:lvl>
+    <w:lvl w:ilvl="3" w:tentative="1">
+      <w:start w:val="1"/>
+      <w:numFmt w:val="bullet"/>
+      <w:lvlText w:val=""/>
+      <w:lvlJc w:val="left"/>
+      <w:pPr>
+        <w:tabs>
+          <w:tab w:val="num" w:pos="2880"/>
+        </w:tabs>
+        <w:ind w:left="2880" w:hanging="360"/>
+      </w:pPr>
+      <w:rPr>
+        <w:rFonts w:ascii="Wingdings" w:hAnsi="Wingdings" w:hint="default"/>
+        <w:sz w:val="20"/>
+      </w:rPr>
+    </w:lvl>
+    <w:lvl w:ilvl="4" w:tentative="1">
+      <w:start w:val="1"/>
+      <w:numFmt w:val="bullet"/>
+      <w:lvlText w:val=""/>
+      <w:lvlJc w:val="left"/>
+      <w:pPr>
+        <w:tabs>
+          <w:tab w:val="num" w:pos="3600"/>
+        </w:tabs>
+        <w:ind w:left="3600" w:hanging="360"/>
+      </w:pPr>
+      <w:rPr>
+        <w:rFonts w:ascii="Wingdings" w:hAnsi="Wingdings" w:hint="default"/>
+        <w:sz w:val="20"/>
+      </w:rPr>
+    </w:lvl>
+    <w:lvl w:ilvl="5" w:tentative="1">
+      <w:start w:val="1"/>
+      <w:numFmt w:val="bullet"/>
+      <w:lvlText w:val=""/>
+      <w:lvlJc w:val="left"/>
+      <w:pPr>
+        <w:tabs>
+          <w:tab w:val="num" w:pos="4320"/>
+        </w:tabs>
+        <w:ind w:left="4320" w:hanging="360"/>
+      </w:pPr>
+      <w:rPr>
+        <w:rFonts w:ascii="Wingdings" w:hAnsi="Wingdings" w:hint="default"/>
+        <w:sz w:val="20"/>
+      </w:rPr>
+    </w:lvl>
+    <w:lvl w:ilvl="6" w:tentative="1">
+      <w:start w:val="1"/>
+      <w:numFmt w:val="bullet"/>
+      <w:lvlText w:val=""/>
+      <w:lvlJc w:val="left"/>
+      <w:pPr>
+        <w:tabs>
+          <w:tab w:val="num" w:pos="5040"/>
+        </w:tabs>
+        <w:ind w:left="5040" w:hanging="360"/>
+      </w:pPr>
+      <w:rPr>
+        <w:rFonts w:ascii="Wingdings" w:hAnsi="Wingdings" w:hint="default"/>
+        <w:sz w:val="20"/>
+      </w:rPr>
+    </w:lvl>
+    <w:lvl w:ilvl="7" w:tentative="1">
+      <w:start w:val="1"/>
+      <w:numFmt w:val="bullet"/>
+      <w:lvlText w:val=""/>
+      <w:lvlJc w:val="left"/>
+      <w:pPr>
+        <w:tabs>
+          <w:tab w:val="num" w:pos="5760"/>
+        </w:tabs>
+        <w:ind w:left="5760" w:hanging="360"/>
+      </w:pPr>
+      <w:rPr>
+        <w:rFonts w:ascii="Wingdings" w:hAnsi="Wingdings" w:hint="default"/>
+        <w:sz w:val="20"/>
+      </w:rPr>
+    </w:lvl>
+    <w:lvl w:ilvl="8" w:tentative="1">
+      <w:start w:val="1"/>
+      <w:numFmt w:val="bullet"/>
+      <w:lvlText w:val=""/>
+      <w:lvlJc w:val="left"/>
+      <w:pPr>
+        <w:tabs>
+          <w:tab w:val="num" w:pos="6480"/>
+        </w:tabs>
+        <w:ind w:left="6480" w:hanging="360"/>
+      </w:pPr>
+      <w:rPr>
+        <w:rFonts w:ascii="Wingdings" w:hAnsi="Wingdings" w:hint="default"/>
+        <w:sz w:val="20"/>
+      </w:rPr>
+    </w:lvl>
+  </w:abstractNum>
+  <w:abstractNum w:abstractNumId="12" w15:restartNumberingAfterBreak="0">
+    <w:nsid w:val="7051281F"/>
+    <w:multiLevelType w:val="multilevel"/>
+    <w:tmpl w:val="CD2A761A"/>
+    <w:lvl w:ilvl="0">
+      <w:start w:val="1"/>
+      <w:numFmt w:val="bullet"/>
+      <w:lvlText w:val=""/>
+      <w:lvlJc w:val="left"/>
+      <w:pPr>
+        <w:tabs>
+          <w:tab w:val="num" w:pos="720"/>
+        </w:tabs>
+        <w:ind w:left="720" w:hanging="360"/>
+      </w:pPr>
+      <w:rPr>
+        <w:rFonts w:ascii="Symbol" w:hAnsi="Symbol" w:hint="default"/>
+        <w:sz w:val="20"/>
+      </w:rPr>
+    </w:lvl>
+    <w:lvl w:ilvl="1" w:tentative="1">
+      <w:start w:val="1"/>
+      <w:numFmt w:val="bullet"/>
+      <w:lvlText w:val="o"/>
+      <w:lvlJc w:val="left"/>
+      <w:pPr>
+        <w:tabs>
+          <w:tab w:val="num" w:pos="1440"/>
+        </w:tabs>
+        <w:ind w:left="1440" w:hanging="360"/>
+      </w:pPr>
+      <w:rPr>
+        <w:rFonts w:ascii="Courier New" w:hAnsi="Courier New" w:hint="default"/>
+        <w:sz w:val="20"/>
+      </w:rPr>
+    </w:lvl>
+    <w:lvl w:ilvl="2" w:tentative="1">
+      <w:start w:val="1"/>
+      <w:numFmt w:val="bullet"/>
+      <w:lvlText w:val=""/>
+      <w:lvlJc w:val="left"/>
+      <w:pPr>
+        <w:tabs>
+          <w:tab w:val="num" w:pos="2160"/>
+        </w:tabs>
+        <w:ind w:left="2160" w:hanging="360"/>
+      </w:pPr>
+      <w:rPr>
+        <w:rFonts w:ascii="Wingdings" w:hAnsi="Wingdings" w:hint="default"/>
+        <w:sz w:val="20"/>
+      </w:rPr>
+    </w:lvl>
+    <w:lvl w:ilvl="3" w:tentative="1">
+      <w:start w:val="1"/>
+      <w:numFmt w:val="bullet"/>
+      <w:lvlText w:val=""/>
+      <w:lvlJc w:val="left"/>
+      <w:pPr>
+        <w:tabs>
+          <w:tab w:val="num" w:pos="2880"/>
+        </w:tabs>
+        <w:ind w:left="2880" w:hanging="360"/>
+      </w:pPr>
+      <w:rPr>
+        <w:rFonts w:ascii="Wingdings" w:hAnsi="Wingdings" w:hint="default"/>
+        <w:sz w:val="20"/>
+      </w:rPr>
+    </w:lvl>
+    <w:lvl w:ilvl="4" w:tentative="1">
+      <w:start w:val="1"/>
+      <w:numFmt w:val="bullet"/>
+      <w:lvlText w:val=""/>
+      <w:lvlJc w:val="left"/>
+      <w:pPr>
+        <w:tabs>
+          <w:tab w:val="num" w:pos="3600"/>
+        </w:tabs>
+        <w:ind w:left="3600" w:hanging="360"/>
+      </w:pPr>
+      <w:rPr>
+        <w:rFonts w:ascii="Wingdings" w:hAnsi="Wingdings" w:hint="default"/>
+        <w:sz w:val="20"/>
+      </w:rPr>
+    </w:lvl>
+    <w:lvl w:ilvl="5" w:tentative="1">
+      <w:start w:val="1"/>
+      <w:numFmt w:val="bullet"/>
+      <w:lvlText w:val=""/>
+      <w:lvlJc w:val="left"/>
+      <w:pPr>
+        <w:tabs>
+          <w:tab w:val="num" w:pos="4320"/>
+        </w:tabs>
+        <w:ind w:left="4320" w:hanging="360"/>
+      </w:pPr>
+      <w:rPr>
+        <w:rFonts w:ascii="Wingdings" w:hAnsi="Wingdings" w:hint="default"/>
+        <w:sz w:val="20"/>
+      </w:rPr>
+    </w:lvl>
+    <w:lvl w:ilvl="6" w:tentative="1">
+      <w:start w:val="1"/>
+      <w:numFmt w:val="bullet"/>
+      <w:lvlText w:val=""/>
+      <w:lvlJc w:val="left"/>
+      <w:pPr>
+        <w:tabs>
+          <w:tab w:val="num" w:pos="5040"/>
+        </w:tabs>
+        <w:ind w:left="5040" w:hanging="360"/>
+      </w:pPr>
+      <w:rPr>
+        <w:rFonts w:ascii="Wingdings" w:hAnsi="Wingdings" w:hint="default"/>
+        <w:sz w:val="20"/>
+      </w:rPr>
+    </w:lvl>
+    <w:lvl w:ilvl="7" w:tentative="1">
+      <w:start w:val="1"/>
+      <w:numFmt w:val="bullet"/>
+      <w:lvlText w:val=""/>
+      <w:lvlJc w:val="left"/>
+      <w:pPr>
+        <w:tabs>
+          <w:tab w:val="num" w:pos="5760"/>
+        </w:tabs>
+        <w:ind w:left="5760" w:hanging="360"/>
+      </w:pPr>
+      <w:rPr>
+        <w:rFonts w:ascii="Wingdings" w:hAnsi="Wingdings" w:hint="default"/>
+        <w:sz w:val="20"/>
+      </w:rPr>
+    </w:lvl>
+    <w:lvl w:ilvl="8" w:tentative="1">
+      <w:start w:val="1"/>
+      <w:numFmt w:val="bullet"/>
+      <w:lvlText w:val=""/>
+      <w:lvlJc w:val="left"/>
+      <w:pPr>
+        <w:tabs>
+          <w:tab w:val="num" w:pos="6480"/>
+        </w:tabs>
+        <w:ind w:left="6480" w:hanging="360"/>
+      </w:pPr>
+      <w:rPr>
+        <w:rFonts w:ascii="Wingdings" w:hAnsi="Wingdings" w:hint="default"/>
+        <w:sz w:val="20"/>
+      </w:rPr>
+    </w:lvl>
+  </w:abstractNum>
+  <w:abstractNum w:abstractNumId="13" w15:restartNumberingAfterBreak="0">
+    <w:nsid w:val="77E14381"/>
+    <w:multiLevelType w:val="multilevel"/>
+    <w:tmpl w:val="C5C481D6"/>
+    <w:lvl w:ilvl="0">
+      <w:start w:val="1"/>
+      <w:numFmt w:val="bullet"/>
+      <w:lvlText w:val=""/>
+      <w:lvlJc w:val="left"/>
+      <w:pPr>
+        <w:tabs>
+          <w:tab w:val="num" w:pos="720"/>
+        </w:tabs>
+        <w:ind w:left="720" w:hanging="360"/>
+      </w:pPr>
+      <w:rPr>
+        <w:rFonts w:ascii="Symbol" w:hAnsi="Symbol" w:hint="default"/>
+        <w:sz w:val="20"/>
+      </w:rPr>
+    </w:lvl>
+    <w:lvl w:ilvl="1" w:tentative="1">
+      <w:start w:val="1"/>
+      <w:numFmt w:val="bullet"/>
+      <w:lvlText w:val="o"/>
+      <w:lvlJc w:val="left"/>
+      <w:pPr>
+        <w:tabs>
+          <w:tab w:val="num" w:pos="1440"/>
+        </w:tabs>
+        <w:ind w:left="1440" w:hanging="360"/>
+      </w:pPr>
+      <w:rPr>
+        <w:rFonts w:ascii="Courier New" w:hAnsi="Courier New" w:hint="default"/>
+        <w:sz w:val="20"/>
+      </w:rPr>
+    </w:lvl>
+    <w:lvl w:ilvl="2" w:tentative="1">
+      <w:start w:val="1"/>
+      <w:numFmt w:val="bullet"/>
+      <w:lvlText w:val=""/>
+      <w:lvlJc w:val="left"/>
+      <w:pPr>
+        <w:tabs>
+          <w:tab w:val="num" w:pos="2160"/>
+        </w:tabs>
+        <w:ind w:left="2160" w:hanging="360"/>
+      </w:pPr>
+      <w:rPr>
+        <w:rFonts w:ascii="Wingdings" w:hAnsi="Wingdings" w:hint="default"/>
+        <w:sz w:val="20"/>
+      </w:rPr>
+    </w:lvl>
+    <w:lvl w:ilvl="3" w:tentative="1">
+      <w:start w:val="1"/>
+      <w:numFmt w:val="bullet"/>
+      <w:lvlText w:val=""/>
+      <w:lvlJc w:val="left"/>
+      <w:pPr>
+        <w:tabs>
+          <w:tab w:val="num" w:pos="2880"/>
+        </w:tabs>
+        <w:ind w:left="2880" w:hanging="360"/>
+      </w:pPr>
+      <w:rPr>
+        <w:rFonts w:ascii="Wingdings" w:hAnsi="Wingdings" w:hint="default"/>
+        <w:sz w:val="20"/>
+      </w:rPr>
+    </w:lvl>
+    <w:lvl w:ilvl="4" w:tentative="1">
+      <w:start w:val="1"/>
+      <w:numFmt w:val="bullet"/>
+      <w:lvlText w:val=""/>
+      <w:lvlJc w:val="left"/>
+      <w:pPr>
+        <w:tabs>
+          <w:tab w:val="num" w:pos="3600"/>
+        </w:tabs>
+        <w:ind w:left="3600" w:hanging="360"/>
+      </w:pPr>
+      <w:rPr>
+        <w:rFonts w:ascii="Wingdings" w:hAnsi="Wingdings" w:hint="default"/>
+        <w:sz w:val="20"/>
+      </w:rPr>
+    </w:lvl>
+    <w:lvl w:ilvl="5" w:tentative="1">
+      <w:start w:val="1"/>
+      <w:numFmt w:val="bullet"/>
+      <w:lvlText w:val=""/>
+      <w:lvlJc w:val="left"/>
+      <w:pPr>
+        <w:tabs>
+          <w:tab w:val="num" w:pos="4320"/>
+        </w:tabs>
+        <w:ind w:left="4320" w:hanging="360"/>
+      </w:pPr>
+      <w:rPr>
+        <w:rFonts w:ascii="Wingdings" w:hAnsi="Wingdings" w:hint="default"/>
+        <w:sz w:val="20"/>
+      </w:rPr>
+    </w:lvl>
+    <w:lvl w:ilvl="6" w:tentative="1">
+      <w:start w:val="1"/>
+      <w:numFmt w:val="bullet"/>
+      <w:lvlText w:val=""/>
+      <w:lvlJc w:val="left"/>
+      <w:pPr>
+        <w:tabs>
+          <w:tab w:val="num" w:pos="5040"/>
+        </w:tabs>
+        <w:ind w:left="5040" w:hanging="360"/>
+      </w:pPr>
+      <w:rPr>
+        <w:rFonts w:ascii="Wingdings" w:hAnsi="Wingdings" w:hint="default"/>
+        <w:sz w:val="20"/>
+      </w:rPr>
+    </w:lvl>
+    <w:lvl w:ilvl="7" w:tentative="1">
+      <w:start w:val="1"/>
+      <w:numFmt w:val="bullet"/>
+      <w:lvlText w:val=""/>
+      <w:lvlJc w:val="left"/>
+      <w:pPr>
+        <w:tabs>
+          <w:tab w:val="num" w:pos="5760"/>
+        </w:tabs>
+        <w:ind w:left="5760" w:hanging="360"/>
+      </w:pPr>
+      <w:rPr>
+        <w:rFonts w:ascii="Wingdings" w:hAnsi="Wingdings" w:hint="default"/>
+        <w:sz w:val="20"/>
+      </w:rPr>
+    </w:lvl>
+    <w:lvl w:ilvl="8" w:tentative="1">
+      <w:start w:val="1"/>
+      <w:numFmt w:val="bullet"/>
+      <w:lvlText w:val=""/>
+      <w:lvlJc w:val="left"/>
+      <w:pPr>
+        <w:tabs>
+          <w:tab w:val="num" w:pos="6480"/>
+        </w:tabs>
+        <w:ind w:left="6480" w:hanging="360"/>
+      </w:pPr>
+      <w:rPr>
+        <w:rFonts w:ascii="Wingdings" w:hAnsi="Wingdings" w:hint="default"/>
+        <w:sz w:val="20"/>
+      </w:rPr>
+    </w:lvl>
+  </w:abstractNum>
+  <w:abstractNum w:abstractNumId="14" w15:restartNumberingAfterBreak="0">
+    <w:nsid w:val="7A184AD7"/>
+    <w:multiLevelType w:val="multilevel"/>
+    <w:tmpl w:val="A34E8962"/>
+    <w:lvl w:ilvl="0">
+      <w:start w:val="1"/>
+      <w:numFmt w:val="bullet"/>
+      <w:lvlText w:val=""/>
+      <w:lvlJc w:val="left"/>
+      <w:pPr>
+        <w:tabs>
+          <w:tab w:val="num" w:pos="720"/>
+        </w:tabs>
+        <w:ind w:left="720" w:hanging="360"/>
+      </w:pPr>
+      <w:rPr>
+        <w:rFonts w:ascii="Symbol" w:hAnsi="Symbol" w:hint="default"/>
+        <w:sz w:val="20"/>
+      </w:rPr>
+    </w:lvl>
+    <w:lvl w:ilvl="1">
+      <w:start w:val="1"/>
+      <w:numFmt w:val="bullet"/>
+      <w:lvlText w:val="o"/>
+      <w:lvlJc w:val="left"/>
+      <w:pPr>
+        <w:tabs>
+          <w:tab w:val="num" w:pos="1440"/>
+        </w:tabs>
+        <w:ind w:left="1440" w:hanging="360"/>
+      </w:pPr>
+      <w:rPr>
+        <w:rFonts w:ascii="Courier New" w:hAnsi="Courier New" w:hint="default"/>
+        <w:sz w:val="20"/>
+      </w:rPr>
+    </w:lvl>
+    <w:lvl w:ilvl="2" w:tentative="1">
+      <w:start w:val="1"/>
+      <w:numFmt w:val="bullet"/>
+      <w:lvlText w:val=""/>
+      <w:lvlJc w:val="left"/>
+      <w:pPr>
+        <w:tabs>
+          <w:tab w:val="num" w:pos="2160"/>
+        </w:tabs>
+        <w:ind w:left="2160" w:hanging="360"/>
+      </w:pPr>
+      <w:rPr>
+        <w:rFonts w:ascii="Wingdings" w:hAnsi="Wingdings" w:hint="default"/>
+        <w:sz w:val="20"/>
+      </w:rPr>
+    </w:lvl>
+    <w:lvl w:ilvl="3" w:tentative="1">
+      <w:start w:val="1"/>
+      <w:numFmt w:val="bullet"/>
+      <w:lvlText w:val=""/>
+      <w:lvlJc w:val="left"/>
+      <w:pPr>
+        <w:tabs>
+          <w:tab w:val="num" w:pos="2880"/>
+        </w:tabs>
+        <w:ind w:left="2880" w:hanging="360"/>
+      </w:pPr>
+      <w:rPr>
+        <w:rFonts w:ascii="Wingdings" w:hAnsi="Wingdings" w:hint="default"/>
+        <w:sz w:val="20"/>
+      </w:rPr>
+    </w:lvl>
+    <w:lvl w:ilvl="4" w:tentative="1">
+      <w:start w:val="1"/>
+      <w:numFmt w:val="bullet"/>
+      <w:lvlText w:val=""/>
+      <w:lvlJc w:val="left"/>
+      <w:pPr>
+        <w:tabs>
+          <w:tab w:val="num" w:pos="3600"/>
+        </w:tabs>
+        <w:ind w:left="3600" w:hanging="360"/>
+      </w:pPr>
+      <w:rPr>
+        <w:rFonts w:ascii="Wingdings" w:hAnsi="Wingdings" w:hint="default"/>
+        <w:sz w:val="20"/>
+      </w:rPr>
+    </w:lvl>
+    <w:lvl w:ilvl="5" w:tentative="1">
+      <w:start w:val="1"/>
+      <w:numFmt w:val="bullet"/>
+      <w:lvlText w:val=""/>
+      <w:lvlJc w:val="left"/>
+      <w:pPr>
+        <w:tabs>
+          <w:tab w:val="num" w:pos="4320"/>
+        </w:tabs>
+        <w:ind w:left="4320" w:hanging="360"/>
+      </w:pPr>
+      <w:rPr>
+        <w:rFonts w:ascii="Wingdings" w:hAnsi="Wingdings" w:hint="default"/>
+        <w:sz w:val="20"/>
+      </w:rPr>
+    </w:lvl>
+    <w:lvl w:ilvl="6" w:tentative="1">
+      <w:start w:val="1"/>
+      <w:numFmt w:val="bullet"/>
+      <w:lvlText w:val=""/>
+      <w:lvlJc w:val="left"/>
+      <w:pPr>
+        <w:tabs>
+          <w:tab w:val="num" w:pos="5040"/>
+        </w:tabs>
+        <w:ind w:left="5040" w:hanging="360"/>
+      </w:pPr>
+      <w:rPr>
+        <w:rFonts w:ascii="Wingdings" w:hAnsi="Wingdings" w:hint="default"/>
+        <w:sz w:val="20"/>
+      </w:rPr>
+    </w:lvl>
+    <w:lvl w:ilvl="7" w:tentative="1">
+      <w:start w:val="1"/>
+      <w:numFmt w:val="bullet"/>
+      <w:lvlText w:val=""/>
+      <w:lvlJc w:val="left"/>
+      <w:pPr>
+        <w:tabs>
+          <w:tab w:val="num" w:pos="5760"/>
+        </w:tabs>
+        <w:ind w:left="5760" w:hanging="360"/>
+      </w:pPr>
+      <w:rPr>
+        <w:rFonts w:ascii="Wingdings" w:hAnsi="Wingdings" w:hint="default"/>
+        <w:sz w:val="20"/>
+      </w:rPr>
+    </w:lvl>
+    <w:lvl w:ilvl="8" w:tentative="1">
+      <w:start w:val="1"/>
+      <w:numFmt w:val="bullet"/>
+      <w:lvlText w:val=""/>
+      <w:lvlJc w:val="left"/>
+      <w:pPr>
+        <w:tabs>
+          <w:tab w:val="num" w:pos="6480"/>
+        </w:tabs>
+        <w:ind w:left="6480" w:hanging="360"/>
+      </w:pPr>
+      <w:rPr>
+        <w:rFonts w:ascii="Wingdings" w:hAnsi="Wingdings" w:hint="default"/>
+        <w:sz w:val="20"/>
+      </w:rPr>
+    </w:lvl>
+  </w:abstractNum>
   <w:num w:numId="1" w16cid:durableId="92407572">
+    <w:abstractNumId w:val="5"/>
+  </w:num>
+  <w:num w:numId="2" w16cid:durableId="762989645">
+    <w:abstractNumId w:val="4"/>
+  </w:num>
+  <w:num w:numId="3" w16cid:durableId="102040531">
+    <w:abstractNumId w:val="9"/>
+  </w:num>
+  <w:num w:numId="4" w16cid:durableId="648284336">
+    <w:abstractNumId w:val="12"/>
+  </w:num>
+  <w:num w:numId="5" w16cid:durableId="2106801988">
+    <w:abstractNumId w:val="14"/>
+  </w:num>
+  <w:num w:numId="6" w16cid:durableId="384914867">
+    <w:abstractNumId w:val="10"/>
+  </w:num>
+  <w:num w:numId="7" w16cid:durableId="834878116">
+    <w:abstractNumId w:val="1"/>
+  </w:num>
+  <w:num w:numId="8" w16cid:durableId="1585871022">
+    <w:abstractNumId w:val="11"/>
+  </w:num>
+  <w:num w:numId="9" w16cid:durableId="905804482">
+    <w:abstractNumId w:val="13"/>
+  </w:num>
+  <w:num w:numId="10" w16cid:durableId="1009719318">
+    <w:abstractNumId w:val="8"/>
+  </w:num>
+  <w:num w:numId="11" w16cid:durableId="754667428">
+    <w:abstractNumId w:val="7"/>
+  </w:num>
+  <w:num w:numId="12" w16cid:durableId="1180466298">
+    <w:abstractNumId w:val="2"/>
+  </w:num>
+  <w:num w:numId="13" w16cid:durableId="802160862">
+    <w:abstractNumId w:val="6"/>
+  </w:num>
+  <w:num w:numId="14" w16cid:durableId="2125726493">
     <w:abstractNumId w:val="0"/>
+  </w:num>
+  <w:num w:numId="15" w16cid:durableId="301732513">
+    <w:abstractNumId w:val="3"/>
   </w:num>
 </w:numbering>
 </file>
@@ -1064,7 +3968,6 @@
   <w:style w:type="character" w:default="1" w:styleId="DefaultParagraphFont">
     <w:name w:val="Default Paragraph Font"/>
     <w:uiPriority w:val="1"/>
-    <w:semiHidden/>
     <w:unhideWhenUsed/>
   </w:style>
   <w:style w:type="table" w:default="1" w:styleId="TableNormal">

</xml_diff>